<commit_message>
docs: explain access policy defaults and record design decisions
Signed-off-by: Everett Williams <everett@medplum.com>
</commit_message>
<xml_diff>
--- a/packages/docs/static/decision-guides/access-control.docx
+++ b/packages/docs/static/decision-guides/access-control.docx
@@ -49,7 +49,7 @@
         </w:drawing>
       </w:r>
     </w:p>
-    <w:bookmarkStart w:id="68" w:name="access-control-decision-guide"/>
+    <w:bookmarkStart w:id="69" w:name="access-control-decision-guide"/>
     <w:p>
       <w:pPr>
         <w:pStyle w:val="Heading1"/>
@@ -3508,6 +3508,24 @@
         <w:pStyle w:val="BodyText"/>
       </w:pPr>
       <w:r>
+        <w:rPr>
+          <w:b/>
+          <w:bCs/>
+        </w:rPr>
+        <w:t xml:space="preserve">Default or custom policy?</w:t>
+      </w:r>
+      <w:r>
+        <w:t xml:space="preserve"> </w:t>
+      </w:r>
+      <w:r>
+        <w:t xml:space="preserve">The built-in Admin default grants broad read/write access. When admin status changes, Medplum swaps the recognized Practitioner/Admin default to the matching default, if configured. Custom policy assignments are unchanged by this swap; the admin flag still changes administrative capabilities. Use an explicit custom policy when the defaults are too broad.</w:t>
+      </w:r>
+    </w:p>
+    <w:p>
+      <w:pPr>
+        <w:pStyle w:val="BodyText"/>
+      </w:pPr>
+      <w:r>
         <w:t xml:space="preserve">Implementation:</w:t>
       </w:r>
       <w:r>
@@ -3731,6 +3749,77 @@
         </w:tc>
       </w:tr>
     </w:tbl>
+    <w:p>
+      <w:pPr>
+        <w:pStyle w:val="BodyText"/>
+      </w:pPr>
+      <w:r>
+        <w:rPr>
+          <w:b/>
+          <w:bCs/>
+        </w:rPr>
+        <w:t xml:space="preserve">Check both enrollment paths.</w:t>
+      </w:r>
+      <w:r>
+        <w:t xml:space="preserve"> </w:t>
+      </w:r>
+      <w:r>
+        <w:t xml:space="preserve">Open registration uses</w:t>
+      </w:r>
+      <w:r>
+        <w:t xml:space="preserve"> </w:t>
+      </w:r>
+      <w:r>
+        <w:rPr>
+          <w:rStyle w:val="VerbatimChar"/>
+        </w:rPr>
+        <w:t xml:space="preserve">Project.defaultPatientAccessPolicy</w:t>
+      </w:r>
+      <w:r>
+        <w:t xml:space="preserve">. Patient invitations without an explicit policy prefer the Patient entry in</w:t>
+      </w:r>
+      <w:r>
+        <w:t xml:space="preserve"> </w:t>
+      </w:r>
+      <w:r>
+        <w:rPr>
+          <w:rStyle w:val="VerbatimChar"/>
+        </w:rPr>
+        <w:t xml:space="preserve">Project.defaultAccessPolicies</w:t>
+      </w:r>
+      <w:r>
+        <w:t xml:space="preserve">, falling back to</w:t>
+      </w:r>
+      <w:r>
+        <w:t xml:space="preserve"> </w:t>
+      </w:r>
+      <w:r>
+        <w:rPr>
+          <w:rStyle w:val="VerbatimChar"/>
+        </w:rPr>
+        <w:t xml:space="preserve">defaultPatientAccessPolicy</w:t>
+      </w:r>
+      <w:r>
+        <w:t xml:space="preserve"> </w:t>
+      </w:r>
+      <w:r>
+        <w:t xml:space="preserve">if that entry is absent. Align these defaults if both paths should grant the same access. Changing the registration default affects future registrations; it does not migrate existing memberships. See</w:t>
+      </w:r>
+      <w:r>
+        <w:t xml:space="preserve"> </w:t>
+      </w:r>
+      <w:hyperlink r:id="rId55">
+        <w:r>
+          <w:rPr>
+            <w:rStyle w:val="Hyperlink"/>
+          </w:rPr>
+          <w:t xml:space="preserve">Default Access Policies</w:t>
+        </w:r>
+      </w:hyperlink>
+      <w:r>
+        <w:t xml:space="preserve">.</w:t>
+      </w:r>
+    </w:p>
     <w:bookmarkEnd w:id="58"/>
     <w:bookmarkStart w:id="61" w:name="X868e7299423d828dfd74eb8e917ec75612cf272"/>
     <w:p>
@@ -4667,7 +4756,127 @@
     </w:p>
     <w:bookmarkEnd w:id="66"/>
     <w:bookmarkEnd w:id="67"/>
+    <w:bookmarkStart w:id="68" w:name="decisions-to-record"/>
+    <w:p>
+      <w:pPr>
+        <w:pStyle w:val="Heading2"/>
+      </w:pPr>
+      <w:r>
+        <w:t xml:space="preserve">Decisions to Record</w:t>
+      </w:r>
+    </w:p>
+    <w:p>
+      <w:pPr>
+        <w:pStyle w:val="Compact"/>
+        <w:numPr>
+          <w:ilvl w:val="0"/>
+          <w:numId w:val="1006"/>
+        </w:numPr>
+      </w:pPr>
+      <w:r>
+        <w:rPr>
+          <w:b/>
+          <w:bCs/>
+        </w:rPr>
+        <w:t xml:space="preserve">Tenant boundaries:</w:t>
+      </w:r>
+      <w:r>
+        <w:t xml:space="preserve"> </w:t>
+      </w:r>
+      <w:r>
+        <w:t xml:space="preserve">Isolated and shared data, including handling of patient transfers.</w:t>
+      </w:r>
+    </w:p>
+    <w:p>
+      <w:pPr>
+        <w:pStyle w:val="Compact"/>
+        <w:numPr>
+          <w:ilvl w:val="0"/>
+          <w:numId w:val="1006"/>
+        </w:numPr>
+      </w:pPr>
+      <w:r>
+        <w:rPr>
+          <w:b/>
+          <w:bCs/>
+        </w:rPr>
+        <w:t xml:space="preserve">Role permissions:</w:t>
+      </w:r>
+      <w:r>
+        <w:t xml:space="preserve"> </w:t>
+      </w:r>
+      <w:r>
+        <w:t xml:space="preserve">Allowed data and actions, distinguishing API restrictions from UI filters.</w:t>
+      </w:r>
+    </w:p>
+    <w:p>
+      <w:pPr>
+        <w:pStyle w:val="Compact"/>
+        <w:numPr>
+          <w:ilvl w:val="0"/>
+          <w:numId w:val="1006"/>
+        </w:numPr>
+      </w:pPr>
+      <w:r>
+        <w:rPr>
+          <w:b/>
+          <w:bCs/>
+        </w:rPr>
+        <w:t xml:space="preserve">Automation identity:</w:t>
+      </w:r>
+      <w:r>
+        <w:t xml:space="preserve"> </w:t>
+      </w:r>
+      <w:r>
+        <w:t xml:space="preserve">Identity and permissions for each Bot or backend service, where applicable.</w:t>
+      </w:r>
+    </w:p>
+    <w:p>
+      <w:pPr>
+        <w:pStyle w:val="Compact"/>
+        <w:numPr>
+          <w:ilvl w:val="0"/>
+          <w:numId w:val="1006"/>
+        </w:numPr>
+      </w:pPr>
+      <w:r>
+        <w:rPr>
+          <w:b/>
+          <w:bCs/>
+        </w:rPr>
+        <w:t xml:space="preserve">Access lifecycle:</w:t>
+      </w:r>
+      <w:r>
+        <w:t xml:space="preserve"> </w:t>
+      </w:r>
+      <w:r>
+        <w:t xml:space="preserve">Owners for grants, changes, revocation, expiry, and transfers.</w:t>
+      </w:r>
+    </w:p>
+    <w:p>
+      <w:pPr>
+        <w:pStyle w:val="Compact"/>
+        <w:numPr>
+          <w:ilvl w:val="0"/>
+          <w:numId w:val="1006"/>
+        </w:numPr>
+      </w:pPr>
+      <w:r>
+        <w:rPr>
+          <w:b/>
+          <w:bCs/>
+        </w:rPr>
+        <w:t xml:space="preserve">API acceptance checks:</w:t>
+      </w:r>
+      <w:r>
+        <w:t xml:space="preserve"> </w:t>
+      </w:r>
+      <w:r>
+        <w:t xml:space="preserve">Requests that should succeed or fail for each role, including after revocation.</w:t>
+      </w:r>
+    </w:p>
     <w:bookmarkEnd w:id="68"/>
+    <w:bookmarkEnd w:id="69"/>
     <w:sectPr>
       <w:pgSz w:h="15840" w:w="12240"/>
       <w:pgMar w:bottom="1440" w:footer="720" w:gutter="0" w:header="720" w:left="1440" w:right="1440" w:top="1440"/>
@@ -5011,6 +5220,9 @@
     <w:abstractNumId w:val="991"/>
   </w:num>
   <w:num w:numId="1005">
+    <w:abstractNumId w:val="991"/>
+  </w:num>
+  <w:num w:numId="1006">
     <w:abstractNumId w:val="991"/>
   </w:num>
 </w:numbering>

</xml_diff>

<commit_message>
docs: remove access control decisions checklist
Signed-off-by: Everett Williams <everett@medplum.com>
</commit_message>
<xml_diff>
--- a/packages/docs/static/decision-guides/access-control.docx
+++ b/packages/docs/static/decision-guides/access-control.docx
@@ -49,7 +49,7 @@
         </w:drawing>
       </w:r>
     </w:p>
-    <w:bookmarkStart w:id="69" w:name="access-control-decision-guide"/>
+    <w:bookmarkStart w:id="68" w:name="access-control-decision-guide"/>
     <w:p>
       <w:pPr>
         <w:pStyle w:val="Heading1"/>
@@ -4756,127 +4756,7 @@
     </w:p>
     <w:bookmarkEnd w:id="66"/>
     <w:bookmarkEnd w:id="67"/>
-    <w:bookmarkStart w:id="68" w:name="decisions-to-record"/>
-    <w:p>
-      <w:pPr>
-        <w:pStyle w:val="Heading2"/>
-      </w:pPr>
-      <w:r>
-        <w:t xml:space="preserve">Decisions to Record</w:t>
-      </w:r>
-    </w:p>
-    <w:p>
-      <w:pPr>
-        <w:pStyle w:val="Compact"/>
-        <w:numPr>
-          <w:ilvl w:val="0"/>
-          <w:numId w:val="1006"/>
-        </w:numPr>
-      </w:pPr>
-      <w:r>
-        <w:rPr>
-          <w:b/>
-          <w:bCs/>
-        </w:rPr>
-        <w:t xml:space="preserve">Tenant boundaries:</w:t>
-      </w:r>
-      <w:r>
-        <w:t xml:space="preserve"> </w:t>
-      </w:r>
-      <w:r>
-        <w:t xml:space="preserve">Isolated and shared data, including handling of patient transfers.</w:t>
-      </w:r>
-    </w:p>
-    <w:p>
-      <w:pPr>
-        <w:pStyle w:val="Compact"/>
-        <w:numPr>
-          <w:ilvl w:val="0"/>
-          <w:numId w:val="1006"/>
-        </w:numPr>
-      </w:pPr>
-      <w:r>
-        <w:rPr>
-          <w:b/>
-          <w:bCs/>
-        </w:rPr>
-        <w:t xml:space="preserve">Role permissions:</w:t>
-      </w:r>
-      <w:r>
-        <w:t xml:space="preserve"> </w:t>
-      </w:r>
-      <w:r>
-        <w:t xml:space="preserve">Allowed data and actions, distinguishing API restrictions from UI filters.</w:t>
-      </w:r>
-    </w:p>
-    <w:p>
-      <w:pPr>
-        <w:pStyle w:val="Compact"/>
-        <w:numPr>
-          <w:ilvl w:val="0"/>
-          <w:numId w:val="1006"/>
-        </w:numPr>
-      </w:pPr>
-      <w:r>
-        <w:rPr>
-          <w:b/>
-          <w:bCs/>
-        </w:rPr>
-        <w:t xml:space="preserve">Automation identity:</w:t>
-      </w:r>
-      <w:r>
-        <w:t xml:space="preserve"> </w:t>
-      </w:r>
-      <w:r>
-        <w:t xml:space="preserve">Identity and permissions for each Bot or backend service, where applicable.</w:t>
-      </w:r>
-    </w:p>
-    <w:p>
-      <w:pPr>
-        <w:pStyle w:val="Compact"/>
-        <w:numPr>
-          <w:ilvl w:val="0"/>
-          <w:numId w:val="1006"/>
-        </w:numPr>
-      </w:pPr>
-      <w:r>
-        <w:rPr>
-          <w:b/>
-          <w:bCs/>
-        </w:rPr>
-        <w:t xml:space="preserve">Access lifecycle:</w:t>
-      </w:r>
-      <w:r>
-        <w:t xml:space="preserve"> </w:t>
-      </w:r>
-      <w:r>
-        <w:t xml:space="preserve">Owners for grants, changes, revocation, expiry, and transfers.</w:t>
-      </w:r>
-    </w:p>
-    <w:p>
-      <w:pPr>
-        <w:pStyle w:val="Compact"/>
-        <w:numPr>
-          <w:ilvl w:val="0"/>
-          <w:numId w:val="1006"/>
-        </w:numPr>
-      </w:pPr>
-      <w:r>
-        <w:rPr>
-          <w:b/>
-          <w:bCs/>
-        </w:rPr>
-        <w:t xml:space="preserve">API acceptance checks:</w:t>
-      </w:r>
-      <w:r>
-        <w:t xml:space="preserve"> </w:t>
-      </w:r>
-      <w:r>
-        <w:t xml:space="preserve">Requests that should succeed or fail for each role, including after revocation.</w:t>
-      </w:r>
-    </w:p>
     <w:bookmarkEnd w:id="68"/>
-    <w:bookmarkEnd w:id="69"/>
     <w:sectPr>
       <w:pgSz w:h="15840" w:w="12240"/>
       <w:pgMar w:bottom="1440" w:footer="720" w:gutter="0" w:header="720" w:left="1440" w:right="1440" w:top="1440"/>
@@ -5220,9 +5100,6 @@
     <w:abstractNumId w:val="991"/>
   </w:num>
   <w:num w:numId="1005">
-    <w:abstractNumId w:val="991"/>
-  </w:num>
-  <w:num w:numId="1006">
     <w:abstractNumId w:val="991"/>
   </w:num>
 </w:numbering>

</xml_diff>

<commit_message>
docs: simplify access control guide navigation
Signed-off-by: Everett Williams <everett@medplum.com>
</commit_message>
<xml_diff>
--- a/packages/docs/static/decision-guides/access-control.docx
+++ b/packages/docs/static/decision-guides/access-control.docx
@@ -49,7 +49,7 @@
         </w:drawing>
       </w:r>
     </w:p>
-    <w:bookmarkStart w:id="68" w:name="access-control-decision-guide"/>
+    <w:bookmarkStart w:id="75" w:name="access-control-decision-guide"/>
     <w:p>
       <w:pPr>
         <w:pStyle w:val="Heading1"/>
@@ -131,21 +131,7 @@
         <w:pStyle w:val="BodyText"/>
       </w:pPr>
       <w:r>
-        <w:t xml:space="preserve">Identify your users and organizational structure, then</w:t>
-      </w:r>
-      <w:r>
-        <w:t xml:space="preserve"> </w:t>
-      </w:r>
-      <w:hyperlink w:anchor="X61abe05f109594ea1ae94120769161a7c0895c3">
-        <w:r>
-          <w:rPr>
-            <w:rStyle w:val="Hyperlink"/>
-          </w:rPr>
-          <w:t xml:space="preserve">distinguish API restrictions from UI filtering</w:t>
-        </w:r>
-      </w:hyperlink>
-      <w:r>
-        <w:t xml:space="preserve">. Work through these decisions for the access the API must enforce:</w:t>
+        <w:t xml:space="preserve">Plan access control around four choices:</w:t>
       </w:r>
     </w:p>
     <w:p>
@@ -156,21 +142,21 @@
           <w:numId w:val="1001"/>
         </w:numPr>
       </w:pPr>
-      <w:hyperlink w:anchor="Xcecb4e14f589b61f9519f4ca8464e72fb7d268e">
+      <w:hyperlink w:anchor="data-separation-and-sharing">
         <w:r>
           <w:rPr>
             <w:rStyle w:val="Hyperlink"/>
             <w:b/>
             <w:bCs/>
           </w:rPr>
-          <w:t xml:space="preserve">How will you separate and share data?</w:t>
+          <w:t xml:space="preserve">Define data separation and sharing</w:t>
         </w:r>
       </w:hyperlink>
       <w:r>
         <w:t xml:space="preserve"> </w:t>
       </w:r>
       <w:r>
-        <w:t xml:space="preserve">For applications with internal or multi-organization isolation.</w:t>
+        <w:t xml:space="preserve">if organizations, locations, teams, or service lines need isolation. Choose tenant boundaries, shared resources, and how enrollment or transfers change access.</w:t>
       </w:r>
     </w:p>
     <w:p>
@@ -181,21 +167,28 @@
           <w:numId w:val="1001"/>
         </w:numPr>
       </w:pPr>
-      <w:hyperlink w:anchor="Xbb0c278d81283a4725515975d5ae02ca213a431">
+      <w:hyperlink w:anchor="role-data-scope">
         <w:r>
           <w:rPr>
             <w:rStyle w:val="Hyperlink"/>
             <w:b/>
             <w:bCs/>
           </w:rPr>
-          <w:t xml:space="preserve">Which data should each role be able to access?</w:t>
+          <w:t xml:space="preserve">Choose each role’s data scope</w:t>
         </w:r>
       </w:hyperlink>
       <w:r>
-        <w:t xml:space="preserve"> </w:t>
-      </w:r>
-      <w:r>
-        <w:t xml:space="preserve">Define each role’s scope.</w:t>
+        <w:rPr>
+          <w:b/>
+          <w:bCs/>
+        </w:rPr>
+        <w:t xml:space="preserve">.</w:t>
+      </w:r>
+      <w:r>
+        <w:t xml:space="preserve"> </w:t>
+      </w:r>
+      <w:r>
+        <w:t xml:space="preserve">For multiple tenants, decide whether access is combined across tenants or separated by authenticated session.</w:t>
       </w:r>
     </w:p>
     <w:p>
@@ -206,21 +199,28 @@
           <w:numId w:val="1001"/>
         </w:numPr>
       </w:pPr>
-      <w:hyperlink w:anchor="X42a041ebbf4cde02e18f5b08766ec1c8ef5d5f3">
+      <w:hyperlink w:anchor="role-permissions">
         <w:r>
           <w:rPr>
             <w:rStyle w:val="Hyperlink"/>
             <w:b/>
             <w:bCs/>
           </w:rPr>
-          <w:t xml:space="preserve">What should each role be allowed to do?</w:t>
+          <w:t xml:space="preserve">Define role permissions</w:t>
         </w:r>
       </w:hyperlink>
       <w:r>
-        <w:t xml:space="preserve"> </w:t>
-      </w:r>
-      <w:r>
-        <w:t xml:space="preserve">Choose permissions and any restrictions.</w:t>
+        <w:rPr>
+          <w:b/>
+          <w:bCs/>
+        </w:rPr>
+        <w:t xml:space="preserve">.</w:t>
+      </w:r>
+      <w:r>
+        <w:t xml:space="preserve"> </w:t>
+      </w:r>
+      <w:r>
+        <w:t xml:space="preserve">Choose resource types and interactions, then add field restrictions, write constraints, or attribute filters where needed.</w:t>
       </w:r>
     </w:p>
     <w:p>
@@ -231,21 +231,28 @@
           <w:numId w:val="1001"/>
         </w:numPr>
       </w:pPr>
-      <w:hyperlink w:anchor="Xdcf65e12ff258a894869928054da5a9ce38bb61">
+      <w:hyperlink w:anchor="administration">
         <w:r>
           <w:rPr>
             <w:rStyle w:val="Hyperlink"/>
             <w:b/>
             <w:bCs/>
           </w:rPr>
-          <w:t xml:space="preserve">Who will administer users and configuration?</w:t>
+          <w:t xml:space="preserve">Assign administration</w:t>
         </w:r>
       </w:hyperlink>
       <w:r>
-        <w:t xml:space="preserve"> </w:t>
-      </w:r>
-      <w:r>
-        <w:t xml:space="preserve">Assign administrative responsibilities.</w:t>
+        <w:rPr>
+          <w:b/>
+          <w:bCs/>
+        </w:rPr>
+        <w:t xml:space="preserve">.</w:t>
+      </w:r>
+      <w:r>
+        <w:t xml:space="preserve"> </w:t>
+      </w:r>
+      <w:r>
+        <w:t xml:space="preserve">Decide who manages users, memberships, and configuration, including the clinical access those administrators need.</w:t>
       </w:r>
     </w:p>
     <w:p>
@@ -253,12 +260,12 @@
         <w:pStyle w:val="FirstParagraph"/>
       </w:pPr>
       <w:r>
-        <w:t xml:space="preserve">Also review</w:t>
-      </w:r>
-      <w:r>
-        <w:t xml:space="preserve"> </w:t>
-      </w:r>
-      <w:hyperlink w:anchor="X1b3a5e1144b0225df3807e086f4dfd1a93e3c1d">
+        <w:t xml:space="preserve">Also plan</w:t>
+      </w:r>
+      <w:r>
+        <w:t xml:space="preserve"> </w:t>
+      </w:r>
+      <w:hyperlink w:anchor="patient-and-caregiver-access">
         <w:r>
           <w:rPr>
             <w:rStyle w:val="Hyperlink"/>
@@ -267,12 +274,15 @@
         </w:r>
       </w:hyperlink>
       <w:r>
-        <w:t xml:space="preserve">,</w:t>
-      </w:r>
-      <w:r>
-        <w:t xml:space="preserve"> </w:t>
-      </w:r>
-      <w:hyperlink w:anchor="how-will-third-party-apps-get-access">
+        <w:t xml:space="preserve"> </w:t>
+      </w:r>
+      <w:r>
+        <w:t xml:space="preserve">if you offer a patient portal,</w:t>
+      </w:r>
+      <w:r>
+        <w:t xml:space="preserve"> </w:t>
+      </w:r>
+      <w:hyperlink w:anchor="third-party-app-access">
         <w:r>
           <w:rPr>
             <w:rStyle w:val="Hyperlink"/>
@@ -281,34 +291,55 @@
         </w:r>
       </w:hyperlink>
       <w:r>
-        <w:t xml:space="preserve">, and</w:t>
-      </w:r>
-      <w:r>
-        <w:t xml:space="preserve"> </w:t>
-      </w:r>
-      <w:hyperlink w:anchor="X0b6fa8281b5f865471d78f98975d7269c9272cd">
+        <w:t xml:space="preserve"> </w:t>
+      </w:r>
+      <w:r>
+        <w:t xml:space="preserve">if you need SMART launch or delegated access, and</w:t>
+      </w:r>
+      <w:r>
+        <w:t xml:space="preserve"> </w:t>
+      </w:r>
+      <w:hyperlink w:anchor="network-restrictions">
         <w:r>
           <w:rPr>
             <w:rStyle w:val="Hyperlink"/>
           </w:rPr>
-          <w:t xml:space="preserve">IP restrictions</w:t>
+          <w:t xml:space="preserve">network restrictions</w:t>
         </w:r>
       </w:hyperlink>
       <w:r>
         <w:t xml:space="preserve"> </w:t>
       </w:r>
       <w:r>
-        <w:t xml:space="preserve">where applicable.</w:t>
-      </w:r>
-    </w:p>
-    <w:p>
-      <w:r>
-        <w:pict>
-          <v:rect style="width:0;height:1.5pt" o:hralign="center" o:hrstd="t" o:hr="t"/>
-        </w:pict>
-      </w:r>
-    </w:p>
-    <w:bookmarkStart w:id="19" w:name="before-you-start"/>
+        <w:t xml:space="preserve">if IP-based controls are required.</w:t>
+      </w:r>
+    </w:p>
+    <w:p>
+      <w:pPr>
+        <w:pStyle w:val="BodyText"/>
+      </w:pPr>
+      <w:r>
+        <w:t xml:space="preserve">Use the</w:t>
+      </w:r>
+      <w:r>
+        <w:t xml:space="preserve"> </w:t>
+      </w:r>
+      <w:hyperlink w:anchor="before-you-start">
+        <w:r>
+          <w:rPr>
+            <w:rStyle w:val="Hyperlink"/>
+          </w:rPr>
+          <w:t xml:space="preserve">questions below</w:t>
+        </w:r>
+      </w:hyperlink>
+      <w:r>
+        <w:t xml:space="preserve"> </w:t>
+      </w:r>
+      <w:r>
+        <w:t xml:space="preserve">to identify your users and organizational structure, then distinguish API restrictions from UI filtering before choosing the relevant access controls. Add requirements beyond these examples where needed.</w:t>
+      </w:r>
+    </w:p>
+    <w:bookmarkStart w:id="20" w:name="before-you-start"/>
     <w:p>
       <w:pPr>
         <w:pStyle w:val="Heading2"/>
@@ -433,7 +464,7 @@
       </w:r>
     </w:p>
     <w:bookmarkEnd w:id="15"/>
-    <w:bookmarkStart w:id="18" w:name="X61abe05f109594ea1ae94120769161a7c0895c3"/>
+    <w:bookmarkStart w:id="19" w:name="X61abe05f109594ea1ae94120769161a7c0895c3"/>
     <w:p>
       <w:pPr>
         <w:pStyle w:val="Heading3"/>
@@ -490,7 +521,7 @@
       </w:r>
     </w:p>
     <w:bookmarkEnd w:id="16"/>
-    <w:bookmarkStart w:id="17" w:name="option-b-change-the-displayed-view"/>
+    <w:bookmarkStart w:id="18" w:name="option-b-change-the-displayed-view"/>
     <w:p>
       <w:pPr>
         <w:pStyle w:val="Heading4"/>
@@ -533,23 +564,18 @@
         <w:t xml:space="preserve">the API defines the permitted access; the UI selects what to display within it. Apply this distinction to tenant boundaries, resource permissions, and individual fields throughout the guide.</w:t>
       </w:r>
     </w:p>
-    <w:p>
-      <w:r>
-        <w:pict>
-          <v:rect style="width:0;height:1.5pt" o:hralign="center" o:hrstd="t" o:hr="t"/>
-        </w:pict>
-      </w:r>
-    </w:p>
+    <w:bookmarkStart w:id="17" w:name="Xcecb4e14f589b61f9519f4ca8464e72fb7d268e"/>
     <w:bookmarkEnd w:id="17"/>
     <w:bookmarkEnd w:id="18"/>
     <w:bookmarkEnd w:id="19"/>
-    <w:bookmarkStart w:id="35" w:name="Xcecb4e14f589b61f9519f4ca8464e72fb7d268e"/>
+    <w:bookmarkEnd w:id="20"/>
+    <w:bookmarkStart w:id="37" w:name="data-separation-and-sharing"/>
     <w:p>
       <w:pPr>
         <w:pStyle w:val="Heading2"/>
       </w:pPr>
       <w:r>
-        <w:t xml:space="preserve">Decision 1: How will you separate and share data?</w:t>
+        <w:t xml:space="preserve">Data separation and sharing</w:t>
       </w:r>
     </w:p>
     <w:p>
@@ -572,12 +598,12 @@
       <w:r>
         <w:t xml:space="preserve"> </w:t>
       </w:r>
-      <w:hyperlink w:anchor="Xbb0c278d81283a4725515975d5ae02ca213a431">
+      <w:hyperlink w:anchor="role-data-scope">
         <w:r>
           <w:rPr>
             <w:rStyle w:val="Hyperlink"/>
           </w:rPr>
-          <w:t xml:space="preserve">Decision 2</w:t>
+          <w:t xml:space="preserve">Role data scope</w:t>
         </w:r>
       </w:hyperlink>
       <w:r>
@@ -670,7 +696,7 @@
       <w:r>
         <w:t xml:space="preserve"> </w:t>
       </w:r>
-      <w:hyperlink r:id="rId20">
+      <w:hyperlink r:id="rId21">
         <w:r>
           <w:rPr>
             <w:rStyle w:val="Hyperlink"/>
@@ -682,7 +708,7 @@
         <w:t xml:space="preserve">.</w:t>
       </w:r>
     </w:p>
-    <w:bookmarkStart w:id="25" w:name="what-does-a-tenant-represent"/>
+    <w:bookmarkStart w:id="26" w:name="what-does-a-tenant-represent"/>
     <w:p>
       <w:pPr>
         <w:pStyle w:val="Heading3"/>
@@ -699,7 +725,7 @@
         <w:t xml:space="preserve">Choose what a tenant represents in your application. What do you call these groups: clinics, programs, sites, or accounts?</w:t>
       </w:r>
     </w:p>
-    <w:bookmarkStart w:id="21" w:name="X75a4c232dbff175c8332acf14cf90246d443162"/>
+    <w:bookmarkStart w:id="22" w:name="X75a4c232dbff175c8332acf14cf90246d443162"/>
     <w:p>
       <w:pPr>
         <w:pStyle w:val="Heading4"/>
@@ -731,8 +757,8 @@
         <w:t xml:space="preserve">when tenants represent clinics, practices, or healthcare organizations in an MSO model.</w:t>
       </w:r>
     </w:p>
-    <w:bookmarkEnd w:id="21"/>
-    <w:bookmarkStart w:id="22" w:name="option-b-service-lines-or-departments"/>
+    <w:bookmarkEnd w:id="22"/>
+    <w:bookmarkStart w:id="23" w:name="option-b-service-lines-or-departments"/>
     <w:p>
       <w:pPr>
         <w:pStyle w:val="Heading4"/>
@@ -764,8 +790,8 @@
         <w:t xml:space="preserve">to represent functional groups within an organization.</w:t>
       </w:r>
     </w:p>
-    <w:bookmarkEnd w:id="22"/>
-    <w:bookmarkStart w:id="23" w:name="X850161c2f839118a2a631ad1f33e1882d930aa2"/>
+    <w:bookmarkEnd w:id="23"/>
+    <w:bookmarkStart w:id="24" w:name="X850161c2f839118a2a631ad1f33e1882d930aa2"/>
     <w:p>
       <w:pPr>
         <w:pStyle w:val="Heading4"/>
@@ -797,8 +823,8 @@
         <w:t xml:space="preserve">per patient.</w:t>
       </w:r>
     </w:p>
-    <w:bookmarkEnd w:id="23"/>
-    <w:bookmarkStart w:id="24" w:name="Xf332685ec2e9f8fe49cdb1017bc3ae1e180da43"/>
+    <w:bookmarkEnd w:id="24"/>
+    <w:bookmarkStart w:id="25" w:name="Xf332685ec2e9f8fe49cdb1017bc3ae1e180da43"/>
     <w:p>
       <w:pPr>
         <w:pStyle w:val="Heading4"/>
@@ -882,9 +908,9 @@
         <w:t xml:space="preserve">Adding a new lowest-level tenant requires a workflow to update every practitioner membership at or above that intermediary.</w:t>
       </w:r>
     </w:p>
-    <w:bookmarkEnd w:id="24"/>
     <w:bookmarkEnd w:id="25"/>
-    <w:bookmarkStart w:id="26" w:name="X813c7d71abbe107f83da315173f0f0ce64598ae"/>
+    <w:bookmarkEnd w:id="26"/>
+    <w:bookmarkStart w:id="27" w:name="X813c7d71abbe107f83da315173f0f0ce64598ae"/>
     <w:p>
       <w:pPr>
         <w:pStyle w:val="Heading3"/>
@@ -913,6 +939,7 @@
           <w:tcPr/>
           <w:p>
             <w:pPr>
+              <w:keepNext/>
               <w:pStyle w:val="Compact"/>
               <w:jc w:val="left"/>
             </w:pPr>
@@ -925,6 +952,7 @@
           <w:tcPr/>
           <w:p>
             <w:pPr>
+              <w:keepNext/>
               <w:pStyle w:val="Compact"/>
               <w:jc w:val="left"/>
             </w:pPr>
@@ -993,8 +1021,8 @@
         </w:tc>
       </w:tr>
     </w:tbl>
-    <w:bookmarkEnd w:id="26"/>
-    <w:bookmarkStart w:id="27" w:name="X53c74cada054b2191e6b0544543092d4fa68379"/>
+    <w:bookmarkEnd w:id="27"/>
+    <w:bookmarkStart w:id="28" w:name="X53c74cada054b2191e6b0544543092d4fa68379"/>
     <w:p>
       <w:pPr>
         <w:pStyle w:val="Heading3"/>
@@ -1023,6 +1051,7 @@
           <w:tcPr/>
           <w:p>
             <w:pPr>
+              <w:keepNext/>
               <w:pStyle w:val="Compact"/>
               <w:jc w:val="left"/>
             </w:pPr>
@@ -1035,6 +1064,7 @@
           <w:tcPr/>
           <w:p>
             <w:pPr>
+              <w:keepNext/>
               <w:pStyle w:val="Compact"/>
               <w:jc w:val="left"/>
             </w:pPr>
@@ -1127,8 +1157,8 @@
         </w:tc>
       </w:tr>
     </w:tbl>
-    <w:bookmarkEnd w:id="27"/>
-    <w:bookmarkStart w:id="30" w:name="X29e3e426735ba765c9aac8ade72e94c468c1446"/>
+    <w:bookmarkEnd w:id="28"/>
+    <w:bookmarkStart w:id="31" w:name="X29e3e426735ba765c9aac8ade72e94c468c1446"/>
     <w:p>
       <w:pPr>
         <w:pStyle w:val="Heading3"/>
@@ -1186,6 +1216,7 @@
           <w:tcPr/>
           <w:p>
             <w:pPr>
+              <w:keepNext/>
               <w:pStyle w:val="Compact"/>
               <w:jc w:val="left"/>
             </w:pPr>
@@ -1198,6 +1229,7 @@
           <w:tcPr/>
           <w:p>
             <w:pPr>
+              <w:keepNext/>
               <w:pStyle w:val="Compact"/>
               <w:jc w:val="left"/>
             </w:pPr>
@@ -1402,7 +1434,7 @@
       <w:r>
         <w:t xml:space="preserve"> </w:t>
       </w:r>
-      <w:hyperlink r:id="rId28">
+      <w:hyperlink r:id="rId29">
         <w:r>
           <w:rPr>
             <w:rStyle w:val="Hyperlink"/>
@@ -1416,7 +1448,7 @@
       <w:r>
         <w:t xml:space="preserve"> </w:t>
       </w:r>
-      <w:hyperlink r:id="rId29">
+      <w:hyperlink r:id="rId30">
         <w:r>
           <w:rPr>
             <w:rStyle w:val="Hyperlink"/>
@@ -1428,8 +1460,8 @@
         <w:t xml:space="preserve">.</w:t>
       </w:r>
     </w:p>
-    <w:bookmarkEnd w:id="30"/>
-    <w:bookmarkStart w:id="34" w:name="Xec55fb0e81d97ea3a2e0be5cf21ff9205af44dd"/>
+    <w:bookmarkEnd w:id="31"/>
+    <w:bookmarkStart w:id="36" w:name="Xec55fb0e81d97ea3a2e0be5cf21ff9205af44dd"/>
     <w:p>
       <w:pPr>
         <w:pStyle w:val="Heading3"/>
@@ -1506,6 +1538,7 @@
           <w:tcPr/>
           <w:p>
             <w:pPr>
+              <w:keepNext/>
               <w:pStyle w:val="Compact"/>
               <w:jc w:val="left"/>
             </w:pPr>
@@ -1518,6 +1551,7 @@
           <w:tcPr/>
           <w:p>
             <w:pPr>
+              <w:keepNext/>
               <w:pStyle w:val="Compact"/>
               <w:jc w:val="left"/>
             </w:pPr>
@@ -1556,7 +1590,7 @@
             <w:r>
               <w:t xml:space="preserve"> </w:t>
             </w:r>
-            <w:hyperlink r:id="rId31">
+            <w:hyperlink r:id="rId32">
               <w:r>
                 <w:rPr>
                   <w:rStyle w:val="VerbatimChar"/>
@@ -1695,7 +1729,7 @@
       <w:r>
         <w:t xml:space="preserve"> </w:t>
       </w:r>
-      <w:hyperlink r:id="rId32">
+      <w:hyperlink r:id="rId33">
         <w:r>
           <w:rPr>
             <w:rStyle w:val="Hyperlink"/>
@@ -1721,7 +1755,7 @@
       <w:r>
         <w:t xml:space="preserve"> </w:t>
       </w:r>
-      <w:hyperlink r:id="rId33">
+      <w:hyperlink r:id="rId34">
         <w:r>
           <w:rPr>
             <w:rStyle w:val="Hyperlink"/>
@@ -1765,27 +1799,29 @@
       <w:r>
         <w:t xml:space="preserve"> </w:t>
       </w:r>
-      <w:hyperlink w:anchor="Xbb0c278d81283a4725515975d5ae02ca213a431">
+      <w:hyperlink w:anchor="role-data-scope">
         <w:r>
           <w:rPr>
             <w:rStyle w:val="Hyperlink"/>
           </w:rPr>
-          <w:t xml:space="preserve">Decision 2</w:t>
+          <w:t xml:space="preserve">Role data scope</w:t>
         </w:r>
       </w:hyperlink>
       <w:r>
         <w:t xml:space="preserve">.</w:t>
       </w:r>
     </w:p>
-    <w:bookmarkEnd w:id="34"/>
+    <w:bookmarkStart w:id="35" w:name="Xbb0c278d81283a4725515975d5ae02ca213a431"/>
     <w:bookmarkEnd w:id="35"/>
-    <w:bookmarkStart w:id="43" w:name="Xbb0c278d81283a4725515975d5ae02ca213a431"/>
+    <w:bookmarkEnd w:id="36"/>
+    <w:bookmarkEnd w:id="37"/>
+    <w:bookmarkStart w:id="46" w:name="role-data-scope"/>
     <w:p>
       <w:pPr>
         <w:pStyle w:val="Heading2"/>
       </w:pPr>
       <w:r>
-        <w:t xml:space="preserve">Decision 2: Which data should each role be able to access?</w:t>
+        <w:t xml:space="preserve">Role data scope</w:t>
       </w:r>
     </w:p>
     <w:p>
@@ -1814,19 +1850,19 @@
       <w:r>
         <w:t xml:space="preserve"> </w:t>
       </w:r>
-      <w:hyperlink w:anchor="X42a041ebbf4cde02e18f5b08766ec1c8ef5d5f3">
+      <w:hyperlink w:anchor="role-permissions">
         <w:r>
           <w:rPr>
             <w:rStyle w:val="Hyperlink"/>
           </w:rPr>
-          <w:t xml:space="preserve">Decision 3</w:t>
+          <w:t xml:space="preserve">Role permissions</w:t>
         </w:r>
       </w:hyperlink>
       <w:r>
         <w:t xml:space="preserve">.</w:t>
       </w:r>
     </w:p>
-    <w:bookmarkStart w:id="36" w:name="option-a-access-to-one-tenant"/>
+    <w:bookmarkStart w:id="38" w:name="option-a-access-to-one-tenant"/>
     <w:p>
       <w:pPr>
         <w:pStyle w:val="Heading3"/>
@@ -1858,8 +1894,8 @@
         <w:t xml:space="preserve">entry parameterized with that tenant.</w:t>
       </w:r>
     </w:p>
-    <w:bookmarkEnd w:id="36"/>
-    <w:bookmarkStart w:id="37" w:name="X313111add5d0b088d84d6352e8797427e39519b"/>
+    <w:bookmarkEnd w:id="38"/>
+    <w:bookmarkStart w:id="39" w:name="X313111add5d0b088d84d6352e8797427e39519b"/>
     <w:p>
       <w:pPr>
         <w:pStyle w:val="Heading3"/>
@@ -1891,8 +1927,8 @@
         <w:t xml:space="preserve">entry per tenant with the same policy.</w:t>
       </w:r>
     </w:p>
-    <w:bookmarkEnd w:id="37"/>
-    <w:bookmarkStart w:id="38" w:name="Xdbb20e895d625d434a981b2c2fe15ab7fb49663"/>
+    <w:bookmarkEnd w:id="39"/>
+    <w:bookmarkStart w:id="40" w:name="Xdbb20e895d625d434a981b2c2fe15ab7fb49663"/>
     <w:p>
       <w:pPr>
         <w:pStyle w:val="Heading3"/>
@@ -1924,8 +1960,8 @@
         <w:t xml:space="preserve">filter.</w:t>
       </w:r>
     </w:p>
-    <w:bookmarkEnd w:id="38"/>
-    <w:bookmarkStart w:id="40" w:name="Xe8cfdb7f0d63a9dd54fd83326352bfde96941a6"/>
+    <w:bookmarkEnd w:id="40"/>
+    <w:bookmarkStart w:id="42" w:name="Xe8cfdb7f0d63a9dd54fd83326352bfde96941a6"/>
     <w:p>
       <w:pPr>
         <w:pStyle w:val="Heading3"/>
@@ -1944,7 +1980,7 @@
       <w:r>
         <w:t xml:space="preserve"> </w:t>
       </w:r>
-      <w:hyperlink r:id="rId39">
+      <w:hyperlink r:id="rId41">
         <w:r>
           <w:rPr>
             <w:rStyle w:val="Hyperlink"/>
@@ -1971,8 +2007,8 @@
         <w:t xml:space="preserve">.</w:t>
       </w:r>
     </w:p>
-    <w:bookmarkEnd w:id="40"/>
-    <w:bookmarkStart w:id="42" w:name="how-do-these-policies-combine"/>
+    <w:bookmarkEnd w:id="42"/>
+    <w:bookmarkStart w:id="45" w:name="how-do-these-policies-combine"/>
     <w:p>
       <w:pPr>
         <w:pStyle w:val="Heading3"/>
@@ -2009,7 +2045,7 @@
       <w:r>
         <w:t xml:space="preserve"> </w:t>
       </w:r>
-      <w:hyperlink r:id="rId41">
+      <w:hyperlink r:id="rId43">
         <w:r>
           <w:rPr>
             <w:rStyle w:val="Hyperlink"/>
@@ -2023,7 +2059,7 @@
       <w:r>
         <w:t xml:space="preserve"> </w:t>
       </w:r>
-      <w:hyperlink r:id="rId39">
+      <w:hyperlink r:id="rId41">
         <w:r>
           <w:rPr>
             <w:rStyle w:val="Hyperlink"/>
@@ -2055,30 +2091,32 @@
       <w:r>
         <w:t xml:space="preserve"> </w:t>
       </w:r>
-      <w:hyperlink w:anchor="X42a041ebbf4cde02e18f5b08766ec1c8ef5d5f3">
+      <w:hyperlink w:anchor="role-permissions">
         <w:r>
           <w:rPr>
             <w:rStyle w:val="Hyperlink"/>
           </w:rPr>
-          <w:t xml:space="preserve">Decision 3</w:t>
+          <w:t xml:space="preserve">Role permissions</w:t>
         </w:r>
       </w:hyperlink>
       <w:r>
         <w:t xml:space="preserve">.</w:t>
       </w:r>
     </w:p>
-    <w:bookmarkEnd w:id="42"/>
-    <w:bookmarkEnd w:id="43"/>
-    <w:bookmarkStart w:id="53" w:name="X42a041ebbf4cde02e18f5b08766ec1c8ef5d5f3"/>
+    <w:bookmarkStart w:id="44" w:name="X42a041ebbf4cde02e18f5b08766ec1c8ef5d5f3"/>
+    <w:bookmarkEnd w:id="44"/>
+    <w:bookmarkEnd w:id="45"/>
+    <w:bookmarkEnd w:id="46"/>
+    <w:bookmarkStart w:id="57" w:name="role-permissions"/>
     <w:p>
       <w:pPr>
         <w:pStyle w:val="Heading2"/>
       </w:pPr>
       <w:r>
-        <w:t xml:space="preserve">Decision 3: What should each role be allowed to do?</w:t>
-      </w:r>
-    </w:p>
-    <w:bookmarkStart w:id="44" w:name="Xd6bccec9c5078dca0276ee9eb44a2b60650a405"/>
+        <w:t xml:space="preserve">Role permissions</w:t>
+      </w:r>
+    </w:p>
+    <w:bookmarkStart w:id="47" w:name="Xd6bccec9c5078dca0276ee9eb44a2b60650a405"/>
     <w:p>
       <w:pPr>
         <w:pStyle w:val="Heading3"/>
@@ -2115,6 +2153,7 @@
           <w:tcPr/>
           <w:p>
             <w:pPr>
+              <w:keepNext/>
               <w:pStyle w:val="Compact"/>
               <w:jc w:val="left"/>
             </w:pPr>
@@ -2127,6 +2166,7 @@
           <w:tcPr/>
           <w:p>
             <w:pPr>
+              <w:keepNext/>
               <w:pStyle w:val="Compact"/>
               <w:jc w:val="left"/>
             </w:pPr>
@@ -2272,8 +2312,8 @@
         </w:tc>
       </w:tr>
     </w:tbl>
-    <w:bookmarkEnd w:id="44"/>
-    <w:bookmarkStart w:id="51" w:name="X9482277add752bcb7b179a08303520dbff42b6d"/>
+    <w:bookmarkEnd w:id="47"/>
+    <w:bookmarkStart w:id="54" w:name="X9482277add752bcb7b179a08303520dbff42b6d"/>
     <w:p>
       <w:pPr>
         <w:pStyle w:val="Heading3"/>
@@ -2294,7 +2334,7 @@
         <w:t xml:space="preserve">Apply only the restrictions your roles need.</w:t>
       </w:r>
     </w:p>
-    <w:bookmarkStart w:id="45" w:name="should-any-fields-be-hidden-or-read-only"/>
+    <w:bookmarkStart w:id="48" w:name="should-any-fields-be-hidden-or-read-only"/>
     <w:p>
       <w:pPr>
         <w:pStyle w:val="Heading4"/>
@@ -2331,6 +2371,7 @@
           <w:tcPr/>
           <w:p>
             <w:pPr>
+              <w:keepNext/>
               <w:pStyle w:val="Compact"/>
               <w:jc w:val="left"/>
             </w:pPr>
@@ -2343,6 +2384,7 @@
           <w:tcPr/>
           <w:p>
             <w:pPr>
+              <w:keepNext/>
               <w:pStyle w:val="Compact"/>
               <w:jc w:val="left"/>
             </w:pPr>
@@ -2457,8 +2499,8 @@
         <w:t xml:space="preserve">Field masking is not a substitute for denying access to a resource. For presentation-only changes, hide fields in the UI.</w:t>
       </w:r>
     </w:p>
-    <w:bookmarkEnd w:id="45"/>
-    <w:bookmarkStart w:id="46" w:name="X1af1c1e706322881b54d3a8e972e9679c2aa49f"/>
+    <w:bookmarkEnd w:id="48"/>
+    <w:bookmarkStart w:id="49" w:name="X1af1c1e706322881b54d3a8e972e9679c2aa49f"/>
     <w:p>
       <w:pPr>
         <w:pStyle w:val="Heading4"/>
@@ -2495,6 +2537,7 @@
           <w:tcPr/>
           <w:p>
             <w:pPr>
+              <w:keepNext/>
               <w:pStyle w:val="Compact"/>
               <w:jc w:val="left"/>
             </w:pPr>
@@ -2507,6 +2550,7 @@
           <w:tcPr/>
           <w:p>
             <w:pPr>
+              <w:keepNext/>
               <w:pStyle w:val="Compact"/>
               <w:jc w:val="left"/>
             </w:pPr>
@@ -2713,8 +2757,8 @@
         <w:t xml:space="preserve">to allow only creates or updates. Keep FHIRPath simple. If a Bot enforces complex rules, use a controlled invocation path; a Subscription-triggered Bot runs after the write and cannot reject it.</w:t>
       </w:r>
     </w:p>
-    <w:bookmarkEnd w:id="46"/>
-    <w:bookmarkStart w:id="50" w:name="X70422c87fcd81384a85dc281c011f062872145d"/>
+    <w:bookmarkEnd w:id="49"/>
+    <w:bookmarkStart w:id="53" w:name="X70422c87fcd81384a85dc281c011f062872145d"/>
     <w:p>
       <w:pPr>
         <w:pStyle w:val="Heading4"/>
@@ -2751,6 +2795,7 @@
           <w:tcPr/>
           <w:p>
             <w:pPr>
+              <w:keepNext/>
               <w:pStyle w:val="Compact"/>
               <w:jc w:val="left"/>
             </w:pPr>
@@ -2763,6 +2808,7 @@
           <w:tcPr/>
           <w:p>
             <w:pPr>
+              <w:keepNext/>
               <w:pStyle w:val="Compact"/>
               <w:jc w:val="left"/>
             </w:pPr>
@@ -3040,7 +3086,7 @@
       <w:r>
         <w:t xml:space="preserve"> </w:t>
       </w:r>
-      <w:hyperlink r:id="rId47">
+      <w:hyperlink r:id="rId50">
         <w:r>
           <w:rPr>
             <w:rStyle w:val="Hyperlink"/>
@@ -3062,7 +3108,7 @@
       <w:r>
         <w:t xml:space="preserve"> </w:t>
       </w:r>
-      <w:hyperlink r:id="rId48">
+      <w:hyperlink r:id="rId51">
         <w:r>
           <w:rPr>
             <w:rStyle w:val="Hyperlink"/>
@@ -3076,7 +3122,7 @@
       <w:r>
         <w:t xml:space="preserve"> </w:t>
       </w:r>
-      <w:hyperlink r:id="rId49">
+      <w:hyperlink r:id="rId52">
         <w:r>
           <w:rPr>
             <w:rStyle w:val="Hyperlink"/>
@@ -3088,9 +3134,9 @@
         <w:t xml:space="preserve">.</w:t>
       </w:r>
     </w:p>
-    <w:bookmarkEnd w:id="50"/>
-    <w:bookmarkEnd w:id="51"/>
-    <w:bookmarkStart w:id="52" w:name="should-the-ui-change-based-on-the-role"/>
+    <w:bookmarkEnd w:id="53"/>
+    <w:bookmarkEnd w:id="54"/>
+    <w:bookmarkStart w:id="56" w:name="should-the-ui-change-based-on-the-role"/>
     <w:p>
       <w:pPr>
         <w:pStyle w:val="Heading3"/>
@@ -3131,6 +3177,7 @@
           <w:tcPr/>
           <w:p>
             <w:pPr>
+              <w:keepNext/>
               <w:pStyle w:val="Compact"/>
               <w:jc w:val="left"/>
             </w:pPr>
@@ -3143,6 +3190,7 @@
           <w:tcPr/>
           <w:p>
             <w:pPr>
+              <w:keepNext/>
               <w:pStyle w:val="Compact"/>
               <w:jc w:val="left"/>
             </w:pPr>
@@ -3243,27 +3291,29 @@
       <w:r>
         <w:t xml:space="preserve"> </w:t>
       </w:r>
-      <w:hyperlink w:anchor="Xdcf65e12ff258a894869928054da5a9ce38bb61">
+      <w:hyperlink w:anchor="administration">
         <w:r>
           <w:rPr>
             <w:rStyle w:val="Hyperlink"/>
           </w:rPr>
-          <w:t xml:space="preserve">Decision 4</w:t>
+          <w:t xml:space="preserve">Administration</w:t>
         </w:r>
       </w:hyperlink>
       <w:r>
         <w:t xml:space="preserve">.</w:t>
       </w:r>
     </w:p>
-    <w:bookmarkEnd w:id="52"/>
-    <w:bookmarkEnd w:id="53"/>
-    <w:bookmarkStart w:id="57" w:name="Xdcf65e12ff258a894869928054da5a9ce38bb61"/>
+    <w:bookmarkStart w:id="55" w:name="Xdcf65e12ff258a894869928054da5a9ce38bb61"/>
+    <w:bookmarkEnd w:id="55"/>
+    <w:bookmarkEnd w:id="56"/>
+    <w:bookmarkEnd w:id="57"/>
+    <w:bookmarkStart w:id="63" w:name="administration"/>
     <w:p>
       <w:pPr>
         <w:pStyle w:val="Heading2"/>
       </w:pPr>
       <w:r>
-        <w:t xml:space="preserve">Decision 4: Who will administer users and configuration?</w:t>
+        <w:t xml:space="preserve">Administration</w:t>
       </w:r>
     </w:p>
     <w:p>
@@ -3294,6 +3344,7 @@
           <w:tcPr/>
           <w:p>
             <w:pPr>
+              <w:keepNext/>
               <w:pStyle w:val="Compact"/>
               <w:jc w:val="left"/>
             </w:pPr>
@@ -3306,6 +3357,7 @@
           <w:tcPr/>
           <w:p>
             <w:pPr>
+              <w:keepNext/>
               <w:pStyle w:val="Compact"/>
               <w:jc w:val="left"/>
             </w:pPr>
@@ -3531,7 +3583,7 @@
       <w:r>
         <w:t xml:space="preserve"> </w:t>
       </w:r>
-      <w:hyperlink r:id="rId54">
+      <w:hyperlink r:id="rId58">
         <w:r>
           <w:rPr>
             <w:rStyle w:val="Hyperlink"/>
@@ -3545,7 +3597,7 @@
       <w:r>
         <w:t xml:space="preserve"> </w:t>
       </w:r>
-      <w:hyperlink r:id="rId55">
+      <w:hyperlink r:id="rId59">
         <w:r>
           <w:rPr>
             <w:rStyle w:val="Hyperlink"/>
@@ -3559,7 +3611,7 @@
       <w:r>
         <w:t xml:space="preserve"> </w:t>
       </w:r>
-      <w:hyperlink r:id="rId56">
+      <w:hyperlink r:id="rId60">
         <w:r>
           <w:rPr>
             <w:rStyle w:val="Hyperlink"/>
@@ -3589,23 +3641,18 @@
         <w:t xml:space="preserve">Review the additional decisions below that apply to your application.</w:t>
       </w:r>
     </w:p>
-    <w:bookmarkEnd w:id="57"/>
-    <w:bookmarkStart w:id="67" w:name="additional-decisions-if-applicable"/>
+    <w:bookmarkStart w:id="61" w:name="additional-decisions-if-applicable"/>
+    <w:bookmarkEnd w:id="61"/>
+    <w:bookmarkStart w:id="62" w:name="X1b3a5e1144b0225df3807e086f4dfd1a93e3c1d"/>
+    <w:bookmarkEnd w:id="62"/>
+    <w:bookmarkEnd w:id="63"/>
+    <w:bookmarkStart w:id="69" w:name="patient-and-caregiver-access"/>
     <w:p>
       <w:pPr>
         <w:pStyle w:val="Heading2"/>
       </w:pPr>
       <w:r>
-        <w:t xml:space="preserve">Additional decisions, if applicable</w:t>
-      </w:r>
-    </w:p>
-    <w:bookmarkStart w:id="62" w:name="X1b3a5e1144b0225df3807e086f4dfd1a93e3c1d"/>
-    <w:p>
-      <w:pPr>
-        <w:pStyle w:val="Heading3"/>
-      </w:pPr>
-      <w:r>
-        <w:t xml:space="preserve">How will patients and caregivers get access?</w:t>
+        <w:t xml:space="preserve">Patient and caregiver access</w:t>
       </w:r>
     </w:p>
     <w:p>
@@ -3628,10 +3675,10 @@
         <w:t xml:space="preserve">Choose how patients register, whether caregivers or proxies need access (such as parents, adult children, or guardians), and how those relationships are established and revoked.</w:t>
       </w:r>
     </w:p>
-    <w:bookmarkStart w:id="58" w:name="how-will-patients-register"/>
-    <w:p>
-      <w:pPr>
-        <w:pStyle w:val="Heading4"/>
+    <w:bookmarkStart w:id="64" w:name="how-will-patients-register"/>
+    <w:p>
+      <w:pPr>
+        <w:pStyle w:val="Heading3"/>
       </w:pPr>
       <w:r>
         <w:t xml:space="preserve">How will patients register?</w:t>
@@ -3657,6 +3704,7 @@
           <w:tcPr/>
           <w:p>
             <w:pPr>
+              <w:keepNext/>
               <w:pStyle w:val="Compact"/>
               <w:jc w:val="left"/>
             </w:pPr>
@@ -3669,6 +3717,7 @@
           <w:tcPr/>
           <w:p>
             <w:pPr>
+              <w:keepNext/>
               <w:pStyle w:val="Compact"/>
               <w:jc w:val="left"/>
             </w:pPr>
@@ -3808,7 +3857,7 @@
       <w:r>
         <w:t xml:space="preserve"> </w:t>
       </w:r>
-      <w:hyperlink r:id="rId55">
+      <w:hyperlink r:id="rId59">
         <w:r>
           <w:rPr>
             <w:rStyle w:val="Hyperlink"/>
@@ -3820,11 +3869,11 @@
         <w:t xml:space="preserve">.</w:t>
       </w:r>
     </w:p>
-    <w:bookmarkEnd w:id="58"/>
-    <w:bookmarkStart w:id="61" w:name="X868e7299423d828dfd74eb8e917ec75612cf272"/>
-    <w:p>
-      <w:pPr>
-        <w:pStyle w:val="Heading4"/>
+    <w:bookmarkEnd w:id="64"/>
+    <w:bookmarkStart w:id="68" w:name="X868e7299423d828dfd74eb8e917ec75612cf272"/>
+    <w:p>
+      <w:pPr>
+        <w:pStyle w:val="Heading3"/>
       </w:pPr>
       <w:r>
         <w:t xml:space="preserve">Which patient records can each person access?</w:t>
@@ -3850,6 +3899,7 @@
           <w:tcPr/>
           <w:p>
             <w:pPr>
+              <w:keepNext/>
               <w:pStyle w:val="Compact"/>
               <w:jc w:val="left"/>
             </w:pPr>
@@ -3862,6 +3912,7 @@
           <w:tcPr/>
           <w:p>
             <w:pPr>
+              <w:keepNext/>
               <w:pStyle w:val="Compact"/>
               <w:jc w:val="left"/>
             </w:pPr>
@@ -4119,7 +4170,7 @@
       <w:r>
         <w:t xml:space="preserve"> </w:t>
       </w:r>
-      <w:hyperlink r:id="rId59">
+      <w:hyperlink r:id="rId65">
         <w:r>
           <w:rPr>
             <w:rStyle w:val="Hyperlink"/>
@@ -4133,7 +4184,7 @@
       <w:r>
         <w:t xml:space="preserve"> </w:t>
       </w:r>
-      <w:hyperlink r:id="rId60">
+      <w:hyperlink r:id="rId66">
         <w:r>
           <w:rPr>
             <w:rStyle w:val="Hyperlink"/>
@@ -4145,15 +4196,17 @@
         <w:t xml:space="preserve">.</w:t>
       </w:r>
     </w:p>
-    <w:bookmarkEnd w:id="61"/>
-    <w:bookmarkEnd w:id="62"/>
-    <w:bookmarkStart w:id="64" w:name="how-will-third-party-apps-get-access"/>
-    <w:p>
-      <w:pPr>
-        <w:pStyle w:val="Heading3"/>
-      </w:pPr>
-      <w:r>
-        <w:t xml:space="preserve">How will third-party apps get access?</w:t>
+    <w:bookmarkStart w:id="67" w:name="how-will-third-party-apps-get-access"/>
+    <w:bookmarkEnd w:id="67"/>
+    <w:bookmarkEnd w:id="68"/>
+    <w:bookmarkEnd w:id="69"/>
+    <w:bookmarkStart w:id="72" w:name="third-party-app-access"/>
+    <w:p>
+      <w:pPr>
+        <w:pStyle w:val="Heading2"/>
+      </w:pPr>
+      <w:r>
+        <w:t xml:space="preserve">Third-party app access</w:t>
       </w:r>
     </w:p>
     <w:p>
@@ -4202,6 +4255,7 @@
           <w:tcPr/>
           <w:p>
             <w:pPr>
+              <w:keepNext/>
               <w:pStyle w:val="Compact"/>
               <w:jc w:val="left"/>
             </w:pPr>
@@ -4214,6 +4268,7 @@
           <w:tcPr/>
           <w:p>
             <w:pPr>
+              <w:keepNext/>
               <w:pStyle w:val="Compact"/>
               <w:jc w:val="left"/>
             </w:pPr>
@@ -4545,7 +4600,7 @@
       <w:r>
         <w:t xml:space="preserve"> </w:t>
       </w:r>
-      <w:hyperlink r:id="rId63">
+      <w:hyperlink r:id="rId70">
         <w:r>
           <w:rPr>
             <w:rStyle w:val="Hyperlink"/>
@@ -4557,14 +4612,16 @@
         <w:t xml:space="preserve">.</w:t>
       </w:r>
     </w:p>
-    <w:bookmarkEnd w:id="64"/>
-    <w:bookmarkStart w:id="66" w:name="X0b6fa8281b5f865471d78f98975d7269c9272cd"/>
-    <w:p>
-      <w:pPr>
-        <w:pStyle w:val="Heading3"/>
-      </w:pPr>
-      <w:r>
-        <w:t xml:space="preserve">Should access be restricted to specific networks?</w:t>
+    <w:bookmarkStart w:id="71" w:name="X0b6fa8281b5f865471d78f98975d7269c9272cd"/>
+    <w:bookmarkEnd w:id="71"/>
+    <w:bookmarkEnd w:id="72"/>
+    <w:bookmarkStart w:id="74" w:name="network-restrictions"/>
+    <w:p>
+      <w:pPr>
+        <w:pStyle w:val="Heading2"/>
+      </w:pPr>
+      <w:r>
+        <w:t xml:space="preserve">Network restrictions</w:t>
       </w:r>
     </w:p>
     <w:p>
@@ -4607,6 +4664,7 @@
           <w:tcPr/>
           <w:p>
             <w:pPr>
+              <w:keepNext/>
               <w:pStyle w:val="Compact"/>
               <w:jc w:val="left"/>
             </w:pPr>
@@ -4619,6 +4677,7 @@
           <w:tcPr/>
           <w:p>
             <w:pPr>
+              <w:keepNext/>
               <w:pStyle w:val="Compact"/>
               <w:jc w:val="left"/>
             </w:pPr>
@@ -4742,7 +4801,7 @@
       <w:r>
         <w:t xml:space="preserve"> </w:t>
       </w:r>
-      <w:hyperlink r:id="rId65">
+      <w:hyperlink r:id="rId73">
         <w:r>
           <w:rPr>
             <w:rStyle w:val="Hyperlink"/>
@@ -4754,9 +4813,8 @@
         <w:t xml:space="preserve">.</w:t>
       </w:r>
     </w:p>
-    <w:bookmarkEnd w:id="66"/>
-    <w:bookmarkEnd w:id="67"/>
-    <w:bookmarkEnd w:id="68"/>
+    <w:bookmarkEnd w:id="74"/>
+    <w:bookmarkEnd w:id="75"/>
     <w:sectPr>
       <w:pgSz w:h="15840" w:w="12240"/>
       <w:pgMar w:bottom="1440" w:footer="720" w:gutter="0" w:header="720" w:left="1440" w:right="1440" w:top="1440"/>

</xml_diff>

<commit_message>
docs: simplify access control guide navigation (#11215)
Signed-off-by: Everett Williams <everett@medplum.com>
</commit_message>
<xml_diff>
--- a/packages/docs/static/decision-guides/access-control.docx
+++ b/packages/docs/static/decision-guides/access-control.docx
@@ -49,7 +49,7 @@
         </w:drawing>
       </w:r>
     </w:p>
-    <w:bookmarkStart w:id="68" w:name="access-control-decision-guide"/>
+    <w:bookmarkStart w:id="75" w:name="access-control-decision-guide"/>
     <w:p>
       <w:pPr>
         <w:pStyle w:val="Heading1"/>
@@ -131,21 +131,7 @@
         <w:pStyle w:val="BodyText"/>
       </w:pPr>
       <w:r>
-        <w:t xml:space="preserve">Identify your users and organizational structure, then</w:t>
-      </w:r>
-      <w:r>
-        <w:t xml:space="preserve"> </w:t>
-      </w:r>
-      <w:hyperlink w:anchor="X61abe05f109594ea1ae94120769161a7c0895c3">
-        <w:r>
-          <w:rPr>
-            <w:rStyle w:val="Hyperlink"/>
-          </w:rPr>
-          <w:t xml:space="preserve">distinguish API restrictions from UI filtering</w:t>
-        </w:r>
-      </w:hyperlink>
-      <w:r>
-        <w:t xml:space="preserve">. Work through these decisions for the access the API must enforce:</w:t>
+        <w:t xml:space="preserve">Plan access control around four choices:</w:t>
       </w:r>
     </w:p>
     <w:p>
@@ -156,21 +142,21 @@
           <w:numId w:val="1001"/>
         </w:numPr>
       </w:pPr>
-      <w:hyperlink w:anchor="Xcecb4e14f589b61f9519f4ca8464e72fb7d268e">
+      <w:hyperlink w:anchor="data-separation-and-sharing">
         <w:r>
           <w:rPr>
             <w:rStyle w:val="Hyperlink"/>
             <w:b/>
             <w:bCs/>
           </w:rPr>
-          <w:t xml:space="preserve">How will you separate and share data?</w:t>
+          <w:t xml:space="preserve">Define data separation and sharing</w:t>
         </w:r>
       </w:hyperlink>
       <w:r>
         <w:t xml:space="preserve"> </w:t>
       </w:r>
       <w:r>
-        <w:t xml:space="preserve">For applications with internal or multi-organization isolation.</w:t>
+        <w:t xml:space="preserve">if organizations, locations, teams, or service lines need isolation. Choose tenant boundaries, shared resources, and how enrollment or transfers change access.</w:t>
       </w:r>
     </w:p>
     <w:p>
@@ -181,21 +167,28 @@
           <w:numId w:val="1001"/>
         </w:numPr>
       </w:pPr>
-      <w:hyperlink w:anchor="Xbb0c278d81283a4725515975d5ae02ca213a431">
+      <w:hyperlink w:anchor="role-data-scope">
         <w:r>
           <w:rPr>
             <w:rStyle w:val="Hyperlink"/>
             <w:b/>
             <w:bCs/>
           </w:rPr>
-          <w:t xml:space="preserve">Which data should each role be able to access?</w:t>
+          <w:t xml:space="preserve">Choose each role’s data scope</w:t>
         </w:r>
       </w:hyperlink>
       <w:r>
-        <w:t xml:space="preserve"> </w:t>
-      </w:r>
-      <w:r>
-        <w:t xml:space="preserve">Define each role’s scope.</w:t>
+        <w:rPr>
+          <w:b/>
+          <w:bCs/>
+        </w:rPr>
+        <w:t xml:space="preserve">.</w:t>
+      </w:r>
+      <w:r>
+        <w:t xml:space="preserve"> </w:t>
+      </w:r>
+      <w:r>
+        <w:t xml:space="preserve">For multiple tenants, decide whether access is combined across tenants or separated by authenticated session.</w:t>
       </w:r>
     </w:p>
     <w:p>
@@ -206,21 +199,28 @@
           <w:numId w:val="1001"/>
         </w:numPr>
       </w:pPr>
-      <w:hyperlink w:anchor="X42a041ebbf4cde02e18f5b08766ec1c8ef5d5f3">
+      <w:hyperlink w:anchor="role-permissions">
         <w:r>
           <w:rPr>
             <w:rStyle w:val="Hyperlink"/>
             <w:b/>
             <w:bCs/>
           </w:rPr>
-          <w:t xml:space="preserve">What should each role be allowed to do?</w:t>
+          <w:t xml:space="preserve">Define role permissions</w:t>
         </w:r>
       </w:hyperlink>
       <w:r>
-        <w:t xml:space="preserve"> </w:t>
-      </w:r>
-      <w:r>
-        <w:t xml:space="preserve">Choose permissions and any restrictions.</w:t>
+        <w:rPr>
+          <w:b/>
+          <w:bCs/>
+        </w:rPr>
+        <w:t xml:space="preserve">.</w:t>
+      </w:r>
+      <w:r>
+        <w:t xml:space="preserve"> </w:t>
+      </w:r>
+      <w:r>
+        <w:t xml:space="preserve">Choose resource types and interactions, then add field restrictions, write constraints, or attribute filters where needed.</w:t>
       </w:r>
     </w:p>
     <w:p>
@@ -231,21 +231,28 @@
           <w:numId w:val="1001"/>
         </w:numPr>
       </w:pPr>
-      <w:hyperlink w:anchor="Xdcf65e12ff258a894869928054da5a9ce38bb61">
+      <w:hyperlink w:anchor="administration">
         <w:r>
           <w:rPr>
             <w:rStyle w:val="Hyperlink"/>
             <w:b/>
             <w:bCs/>
           </w:rPr>
-          <w:t xml:space="preserve">Who will administer users and configuration?</w:t>
+          <w:t xml:space="preserve">Assign administration</w:t>
         </w:r>
       </w:hyperlink>
       <w:r>
-        <w:t xml:space="preserve"> </w:t>
-      </w:r>
-      <w:r>
-        <w:t xml:space="preserve">Assign administrative responsibilities.</w:t>
+        <w:rPr>
+          <w:b/>
+          <w:bCs/>
+        </w:rPr>
+        <w:t xml:space="preserve">.</w:t>
+      </w:r>
+      <w:r>
+        <w:t xml:space="preserve"> </w:t>
+      </w:r>
+      <w:r>
+        <w:t xml:space="preserve">Decide who manages users, memberships, and configuration, including the clinical access those administrators need.</w:t>
       </w:r>
     </w:p>
     <w:p>
@@ -253,12 +260,12 @@
         <w:pStyle w:val="FirstParagraph"/>
       </w:pPr>
       <w:r>
-        <w:t xml:space="preserve">Also review</w:t>
-      </w:r>
-      <w:r>
-        <w:t xml:space="preserve"> </w:t>
-      </w:r>
-      <w:hyperlink w:anchor="X1b3a5e1144b0225df3807e086f4dfd1a93e3c1d">
+        <w:t xml:space="preserve">Also plan</w:t>
+      </w:r>
+      <w:r>
+        <w:t xml:space="preserve"> </w:t>
+      </w:r>
+      <w:hyperlink w:anchor="patient-and-caregiver-access">
         <w:r>
           <w:rPr>
             <w:rStyle w:val="Hyperlink"/>
@@ -267,12 +274,15 @@
         </w:r>
       </w:hyperlink>
       <w:r>
-        <w:t xml:space="preserve">,</w:t>
-      </w:r>
-      <w:r>
-        <w:t xml:space="preserve"> </w:t>
-      </w:r>
-      <w:hyperlink w:anchor="how-will-third-party-apps-get-access">
+        <w:t xml:space="preserve"> </w:t>
+      </w:r>
+      <w:r>
+        <w:t xml:space="preserve">if you offer a patient portal,</w:t>
+      </w:r>
+      <w:r>
+        <w:t xml:space="preserve"> </w:t>
+      </w:r>
+      <w:hyperlink w:anchor="third-party-app-access">
         <w:r>
           <w:rPr>
             <w:rStyle w:val="Hyperlink"/>
@@ -281,34 +291,55 @@
         </w:r>
       </w:hyperlink>
       <w:r>
-        <w:t xml:space="preserve">, and</w:t>
-      </w:r>
-      <w:r>
-        <w:t xml:space="preserve"> </w:t>
-      </w:r>
-      <w:hyperlink w:anchor="X0b6fa8281b5f865471d78f98975d7269c9272cd">
+        <w:t xml:space="preserve"> </w:t>
+      </w:r>
+      <w:r>
+        <w:t xml:space="preserve">if you need SMART launch or delegated access, and</w:t>
+      </w:r>
+      <w:r>
+        <w:t xml:space="preserve"> </w:t>
+      </w:r>
+      <w:hyperlink w:anchor="network-restrictions">
         <w:r>
           <w:rPr>
             <w:rStyle w:val="Hyperlink"/>
           </w:rPr>
-          <w:t xml:space="preserve">IP restrictions</w:t>
+          <w:t xml:space="preserve">network restrictions</w:t>
         </w:r>
       </w:hyperlink>
       <w:r>
         <w:t xml:space="preserve"> </w:t>
       </w:r>
       <w:r>
-        <w:t xml:space="preserve">where applicable.</w:t>
-      </w:r>
-    </w:p>
-    <w:p>
-      <w:r>
-        <w:pict>
-          <v:rect style="width:0;height:1.5pt" o:hralign="center" o:hrstd="t" o:hr="t"/>
-        </w:pict>
-      </w:r>
-    </w:p>
-    <w:bookmarkStart w:id="19" w:name="before-you-start"/>
+        <w:t xml:space="preserve">if IP-based controls are required.</w:t>
+      </w:r>
+    </w:p>
+    <w:p>
+      <w:pPr>
+        <w:pStyle w:val="BodyText"/>
+      </w:pPr>
+      <w:r>
+        <w:t xml:space="preserve">Use the</w:t>
+      </w:r>
+      <w:r>
+        <w:t xml:space="preserve"> </w:t>
+      </w:r>
+      <w:hyperlink w:anchor="before-you-start">
+        <w:r>
+          <w:rPr>
+            <w:rStyle w:val="Hyperlink"/>
+          </w:rPr>
+          <w:t xml:space="preserve">questions below</w:t>
+        </w:r>
+      </w:hyperlink>
+      <w:r>
+        <w:t xml:space="preserve"> </w:t>
+      </w:r>
+      <w:r>
+        <w:t xml:space="preserve">to identify your users and organizational structure, then distinguish API restrictions from UI filtering before choosing the relevant access controls. Add requirements beyond these examples where needed.</w:t>
+      </w:r>
+    </w:p>
+    <w:bookmarkStart w:id="20" w:name="before-you-start"/>
     <w:p>
       <w:pPr>
         <w:pStyle w:val="Heading2"/>
@@ -433,7 +464,7 @@
       </w:r>
     </w:p>
     <w:bookmarkEnd w:id="15"/>
-    <w:bookmarkStart w:id="18" w:name="X61abe05f109594ea1ae94120769161a7c0895c3"/>
+    <w:bookmarkStart w:id="19" w:name="X61abe05f109594ea1ae94120769161a7c0895c3"/>
     <w:p>
       <w:pPr>
         <w:pStyle w:val="Heading3"/>
@@ -490,7 +521,7 @@
       </w:r>
     </w:p>
     <w:bookmarkEnd w:id="16"/>
-    <w:bookmarkStart w:id="17" w:name="option-b-change-the-displayed-view"/>
+    <w:bookmarkStart w:id="18" w:name="option-b-change-the-displayed-view"/>
     <w:p>
       <w:pPr>
         <w:pStyle w:val="Heading4"/>
@@ -533,23 +564,18 @@
         <w:t xml:space="preserve">the API defines the permitted access; the UI selects what to display within it. Apply this distinction to tenant boundaries, resource permissions, and individual fields throughout the guide.</w:t>
       </w:r>
     </w:p>
-    <w:p>
-      <w:r>
-        <w:pict>
-          <v:rect style="width:0;height:1.5pt" o:hralign="center" o:hrstd="t" o:hr="t"/>
-        </w:pict>
-      </w:r>
-    </w:p>
+    <w:bookmarkStart w:id="17" w:name="Xcecb4e14f589b61f9519f4ca8464e72fb7d268e"/>
     <w:bookmarkEnd w:id="17"/>
     <w:bookmarkEnd w:id="18"/>
     <w:bookmarkEnd w:id="19"/>
-    <w:bookmarkStart w:id="35" w:name="Xcecb4e14f589b61f9519f4ca8464e72fb7d268e"/>
+    <w:bookmarkEnd w:id="20"/>
+    <w:bookmarkStart w:id="37" w:name="data-separation-and-sharing"/>
     <w:p>
       <w:pPr>
         <w:pStyle w:val="Heading2"/>
       </w:pPr>
       <w:r>
-        <w:t xml:space="preserve">Decision 1: How will you separate and share data?</w:t>
+        <w:t xml:space="preserve">Data separation and sharing</w:t>
       </w:r>
     </w:p>
     <w:p>
@@ -572,12 +598,12 @@
       <w:r>
         <w:t xml:space="preserve"> </w:t>
       </w:r>
-      <w:hyperlink w:anchor="Xbb0c278d81283a4725515975d5ae02ca213a431">
+      <w:hyperlink w:anchor="role-data-scope">
         <w:r>
           <w:rPr>
             <w:rStyle w:val="Hyperlink"/>
           </w:rPr>
-          <w:t xml:space="preserve">Decision 2</w:t>
+          <w:t xml:space="preserve">Role data scope</w:t>
         </w:r>
       </w:hyperlink>
       <w:r>
@@ -670,7 +696,7 @@
       <w:r>
         <w:t xml:space="preserve"> </w:t>
       </w:r>
-      <w:hyperlink r:id="rId20">
+      <w:hyperlink r:id="rId21">
         <w:r>
           <w:rPr>
             <w:rStyle w:val="Hyperlink"/>
@@ -682,7 +708,7 @@
         <w:t xml:space="preserve">.</w:t>
       </w:r>
     </w:p>
-    <w:bookmarkStart w:id="25" w:name="what-does-a-tenant-represent"/>
+    <w:bookmarkStart w:id="26" w:name="what-does-a-tenant-represent"/>
     <w:p>
       <w:pPr>
         <w:pStyle w:val="Heading3"/>
@@ -699,7 +725,7 @@
         <w:t xml:space="preserve">Choose what a tenant represents in your application. What do you call these groups: clinics, programs, sites, or accounts?</w:t>
       </w:r>
     </w:p>
-    <w:bookmarkStart w:id="21" w:name="X75a4c232dbff175c8332acf14cf90246d443162"/>
+    <w:bookmarkStart w:id="22" w:name="X75a4c232dbff175c8332acf14cf90246d443162"/>
     <w:p>
       <w:pPr>
         <w:pStyle w:val="Heading4"/>
@@ -731,8 +757,8 @@
         <w:t xml:space="preserve">when tenants represent clinics, practices, or healthcare organizations in an MSO model.</w:t>
       </w:r>
     </w:p>
-    <w:bookmarkEnd w:id="21"/>
-    <w:bookmarkStart w:id="22" w:name="option-b-service-lines-or-departments"/>
+    <w:bookmarkEnd w:id="22"/>
+    <w:bookmarkStart w:id="23" w:name="option-b-service-lines-or-departments"/>
     <w:p>
       <w:pPr>
         <w:pStyle w:val="Heading4"/>
@@ -764,8 +790,8 @@
         <w:t xml:space="preserve">to represent functional groups within an organization.</w:t>
       </w:r>
     </w:p>
-    <w:bookmarkEnd w:id="22"/>
-    <w:bookmarkStart w:id="23" w:name="X850161c2f839118a2a631ad1f33e1882d930aa2"/>
+    <w:bookmarkEnd w:id="23"/>
+    <w:bookmarkStart w:id="24" w:name="X850161c2f839118a2a631ad1f33e1882d930aa2"/>
     <w:p>
       <w:pPr>
         <w:pStyle w:val="Heading4"/>
@@ -797,8 +823,8 @@
         <w:t xml:space="preserve">per patient.</w:t>
       </w:r>
     </w:p>
-    <w:bookmarkEnd w:id="23"/>
-    <w:bookmarkStart w:id="24" w:name="Xf332685ec2e9f8fe49cdb1017bc3ae1e180da43"/>
+    <w:bookmarkEnd w:id="24"/>
+    <w:bookmarkStart w:id="25" w:name="Xf332685ec2e9f8fe49cdb1017bc3ae1e180da43"/>
     <w:p>
       <w:pPr>
         <w:pStyle w:val="Heading4"/>
@@ -882,9 +908,9 @@
         <w:t xml:space="preserve">Adding a new lowest-level tenant requires a workflow to update every practitioner membership at or above that intermediary.</w:t>
       </w:r>
     </w:p>
-    <w:bookmarkEnd w:id="24"/>
     <w:bookmarkEnd w:id="25"/>
-    <w:bookmarkStart w:id="26" w:name="X813c7d71abbe107f83da315173f0f0ce64598ae"/>
+    <w:bookmarkEnd w:id="26"/>
+    <w:bookmarkStart w:id="27" w:name="X813c7d71abbe107f83da315173f0f0ce64598ae"/>
     <w:p>
       <w:pPr>
         <w:pStyle w:val="Heading3"/>
@@ -913,6 +939,7 @@
           <w:tcPr/>
           <w:p>
             <w:pPr>
+              <w:keepNext/>
               <w:pStyle w:val="Compact"/>
               <w:jc w:val="left"/>
             </w:pPr>
@@ -925,6 +952,7 @@
           <w:tcPr/>
           <w:p>
             <w:pPr>
+              <w:keepNext/>
               <w:pStyle w:val="Compact"/>
               <w:jc w:val="left"/>
             </w:pPr>
@@ -993,8 +1021,8 @@
         </w:tc>
       </w:tr>
     </w:tbl>
-    <w:bookmarkEnd w:id="26"/>
-    <w:bookmarkStart w:id="27" w:name="X53c74cada054b2191e6b0544543092d4fa68379"/>
+    <w:bookmarkEnd w:id="27"/>
+    <w:bookmarkStart w:id="28" w:name="X53c74cada054b2191e6b0544543092d4fa68379"/>
     <w:p>
       <w:pPr>
         <w:pStyle w:val="Heading3"/>
@@ -1023,6 +1051,7 @@
           <w:tcPr/>
           <w:p>
             <w:pPr>
+              <w:keepNext/>
               <w:pStyle w:val="Compact"/>
               <w:jc w:val="left"/>
             </w:pPr>
@@ -1035,6 +1064,7 @@
           <w:tcPr/>
           <w:p>
             <w:pPr>
+              <w:keepNext/>
               <w:pStyle w:val="Compact"/>
               <w:jc w:val="left"/>
             </w:pPr>
@@ -1127,8 +1157,8 @@
         </w:tc>
       </w:tr>
     </w:tbl>
-    <w:bookmarkEnd w:id="27"/>
-    <w:bookmarkStart w:id="30" w:name="X29e3e426735ba765c9aac8ade72e94c468c1446"/>
+    <w:bookmarkEnd w:id="28"/>
+    <w:bookmarkStart w:id="31" w:name="X29e3e426735ba765c9aac8ade72e94c468c1446"/>
     <w:p>
       <w:pPr>
         <w:pStyle w:val="Heading3"/>
@@ -1186,6 +1216,7 @@
           <w:tcPr/>
           <w:p>
             <w:pPr>
+              <w:keepNext/>
               <w:pStyle w:val="Compact"/>
               <w:jc w:val="left"/>
             </w:pPr>
@@ -1198,6 +1229,7 @@
           <w:tcPr/>
           <w:p>
             <w:pPr>
+              <w:keepNext/>
               <w:pStyle w:val="Compact"/>
               <w:jc w:val="left"/>
             </w:pPr>
@@ -1402,7 +1434,7 @@
       <w:r>
         <w:t xml:space="preserve"> </w:t>
       </w:r>
-      <w:hyperlink r:id="rId28">
+      <w:hyperlink r:id="rId29">
         <w:r>
           <w:rPr>
             <w:rStyle w:val="Hyperlink"/>
@@ -1416,7 +1448,7 @@
       <w:r>
         <w:t xml:space="preserve"> </w:t>
       </w:r>
-      <w:hyperlink r:id="rId29">
+      <w:hyperlink r:id="rId30">
         <w:r>
           <w:rPr>
             <w:rStyle w:val="Hyperlink"/>
@@ -1428,8 +1460,8 @@
         <w:t xml:space="preserve">.</w:t>
       </w:r>
     </w:p>
-    <w:bookmarkEnd w:id="30"/>
-    <w:bookmarkStart w:id="34" w:name="Xec55fb0e81d97ea3a2e0be5cf21ff9205af44dd"/>
+    <w:bookmarkEnd w:id="31"/>
+    <w:bookmarkStart w:id="36" w:name="Xec55fb0e81d97ea3a2e0be5cf21ff9205af44dd"/>
     <w:p>
       <w:pPr>
         <w:pStyle w:val="Heading3"/>
@@ -1506,6 +1538,7 @@
           <w:tcPr/>
           <w:p>
             <w:pPr>
+              <w:keepNext/>
               <w:pStyle w:val="Compact"/>
               <w:jc w:val="left"/>
             </w:pPr>
@@ -1518,6 +1551,7 @@
           <w:tcPr/>
           <w:p>
             <w:pPr>
+              <w:keepNext/>
               <w:pStyle w:val="Compact"/>
               <w:jc w:val="left"/>
             </w:pPr>
@@ -1556,7 +1590,7 @@
             <w:r>
               <w:t xml:space="preserve"> </w:t>
             </w:r>
-            <w:hyperlink r:id="rId31">
+            <w:hyperlink r:id="rId32">
               <w:r>
                 <w:rPr>
                   <w:rStyle w:val="VerbatimChar"/>
@@ -1695,7 +1729,7 @@
       <w:r>
         <w:t xml:space="preserve"> </w:t>
       </w:r>
-      <w:hyperlink r:id="rId32">
+      <w:hyperlink r:id="rId33">
         <w:r>
           <w:rPr>
             <w:rStyle w:val="Hyperlink"/>
@@ -1721,7 +1755,7 @@
       <w:r>
         <w:t xml:space="preserve"> </w:t>
       </w:r>
-      <w:hyperlink r:id="rId33">
+      <w:hyperlink r:id="rId34">
         <w:r>
           <w:rPr>
             <w:rStyle w:val="Hyperlink"/>
@@ -1765,27 +1799,29 @@
       <w:r>
         <w:t xml:space="preserve"> </w:t>
       </w:r>
-      <w:hyperlink w:anchor="Xbb0c278d81283a4725515975d5ae02ca213a431">
+      <w:hyperlink w:anchor="role-data-scope">
         <w:r>
           <w:rPr>
             <w:rStyle w:val="Hyperlink"/>
           </w:rPr>
-          <w:t xml:space="preserve">Decision 2</w:t>
+          <w:t xml:space="preserve">Role data scope</w:t>
         </w:r>
       </w:hyperlink>
       <w:r>
         <w:t xml:space="preserve">.</w:t>
       </w:r>
     </w:p>
-    <w:bookmarkEnd w:id="34"/>
+    <w:bookmarkStart w:id="35" w:name="Xbb0c278d81283a4725515975d5ae02ca213a431"/>
     <w:bookmarkEnd w:id="35"/>
-    <w:bookmarkStart w:id="43" w:name="Xbb0c278d81283a4725515975d5ae02ca213a431"/>
+    <w:bookmarkEnd w:id="36"/>
+    <w:bookmarkEnd w:id="37"/>
+    <w:bookmarkStart w:id="46" w:name="role-data-scope"/>
     <w:p>
       <w:pPr>
         <w:pStyle w:val="Heading2"/>
       </w:pPr>
       <w:r>
-        <w:t xml:space="preserve">Decision 2: Which data should each role be able to access?</w:t>
+        <w:t xml:space="preserve">Role data scope</w:t>
       </w:r>
     </w:p>
     <w:p>
@@ -1814,19 +1850,19 @@
       <w:r>
         <w:t xml:space="preserve"> </w:t>
       </w:r>
-      <w:hyperlink w:anchor="X42a041ebbf4cde02e18f5b08766ec1c8ef5d5f3">
+      <w:hyperlink w:anchor="role-permissions">
         <w:r>
           <w:rPr>
             <w:rStyle w:val="Hyperlink"/>
           </w:rPr>
-          <w:t xml:space="preserve">Decision 3</w:t>
+          <w:t xml:space="preserve">Role permissions</w:t>
         </w:r>
       </w:hyperlink>
       <w:r>
         <w:t xml:space="preserve">.</w:t>
       </w:r>
     </w:p>
-    <w:bookmarkStart w:id="36" w:name="option-a-access-to-one-tenant"/>
+    <w:bookmarkStart w:id="38" w:name="option-a-access-to-one-tenant"/>
     <w:p>
       <w:pPr>
         <w:pStyle w:val="Heading3"/>
@@ -1858,8 +1894,8 @@
         <w:t xml:space="preserve">entry parameterized with that tenant.</w:t>
       </w:r>
     </w:p>
-    <w:bookmarkEnd w:id="36"/>
-    <w:bookmarkStart w:id="37" w:name="X313111add5d0b088d84d6352e8797427e39519b"/>
+    <w:bookmarkEnd w:id="38"/>
+    <w:bookmarkStart w:id="39" w:name="X313111add5d0b088d84d6352e8797427e39519b"/>
     <w:p>
       <w:pPr>
         <w:pStyle w:val="Heading3"/>
@@ -1891,8 +1927,8 @@
         <w:t xml:space="preserve">entry per tenant with the same policy.</w:t>
       </w:r>
     </w:p>
-    <w:bookmarkEnd w:id="37"/>
-    <w:bookmarkStart w:id="38" w:name="Xdbb20e895d625d434a981b2c2fe15ab7fb49663"/>
+    <w:bookmarkEnd w:id="39"/>
+    <w:bookmarkStart w:id="40" w:name="Xdbb20e895d625d434a981b2c2fe15ab7fb49663"/>
     <w:p>
       <w:pPr>
         <w:pStyle w:val="Heading3"/>
@@ -1924,8 +1960,8 @@
         <w:t xml:space="preserve">filter.</w:t>
       </w:r>
     </w:p>
-    <w:bookmarkEnd w:id="38"/>
-    <w:bookmarkStart w:id="40" w:name="Xe8cfdb7f0d63a9dd54fd83326352bfde96941a6"/>
+    <w:bookmarkEnd w:id="40"/>
+    <w:bookmarkStart w:id="42" w:name="Xe8cfdb7f0d63a9dd54fd83326352bfde96941a6"/>
     <w:p>
       <w:pPr>
         <w:pStyle w:val="Heading3"/>
@@ -1944,7 +1980,7 @@
       <w:r>
         <w:t xml:space="preserve"> </w:t>
       </w:r>
-      <w:hyperlink r:id="rId39">
+      <w:hyperlink r:id="rId41">
         <w:r>
           <w:rPr>
             <w:rStyle w:val="Hyperlink"/>
@@ -1971,8 +2007,8 @@
         <w:t xml:space="preserve">.</w:t>
       </w:r>
     </w:p>
-    <w:bookmarkEnd w:id="40"/>
-    <w:bookmarkStart w:id="42" w:name="how-do-these-policies-combine"/>
+    <w:bookmarkEnd w:id="42"/>
+    <w:bookmarkStart w:id="45" w:name="how-do-these-policies-combine"/>
     <w:p>
       <w:pPr>
         <w:pStyle w:val="Heading3"/>
@@ -2009,7 +2045,7 @@
       <w:r>
         <w:t xml:space="preserve"> </w:t>
       </w:r>
-      <w:hyperlink r:id="rId41">
+      <w:hyperlink r:id="rId43">
         <w:r>
           <w:rPr>
             <w:rStyle w:val="Hyperlink"/>
@@ -2023,7 +2059,7 @@
       <w:r>
         <w:t xml:space="preserve"> </w:t>
       </w:r>
-      <w:hyperlink r:id="rId39">
+      <w:hyperlink r:id="rId41">
         <w:r>
           <w:rPr>
             <w:rStyle w:val="Hyperlink"/>
@@ -2055,30 +2091,32 @@
       <w:r>
         <w:t xml:space="preserve"> </w:t>
       </w:r>
-      <w:hyperlink w:anchor="X42a041ebbf4cde02e18f5b08766ec1c8ef5d5f3">
+      <w:hyperlink w:anchor="role-permissions">
         <w:r>
           <w:rPr>
             <w:rStyle w:val="Hyperlink"/>
           </w:rPr>
-          <w:t xml:space="preserve">Decision 3</w:t>
+          <w:t xml:space="preserve">Role permissions</w:t>
         </w:r>
       </w:hyperlink>
       <w:r>
         <w:t xml:space="preserve">.</w:t>
       </w:r>
     </w:p>
-    <w:bookmarkEnd w:id="42"/>
-    <w:bookmarkEnd w:id="43"/>
-    <w:bookmarkStart w:id="53" w:name="X42a041ebbf4cde02e18f5b08766ec1c8ef5d5f3"/>
+    <w:bookmarkStart w:id="44" w:name="X42a041ebbf4cde02e18f5b08766ec1c8ef5d5f3"/>
+    <w:bookmarkEnd w:id="44"/>
+    <w:bookmarkEnd w:id="45"/>
+    <w:bookmarkEnd w:id="46"/>
+    <w:bookmarkStart w:id="57" w:name="role-permissions"/>
     <w:p>
       <w:pPr>
         <w:pStyle w:val="Heading2"/>
       </w:pPr>
       <w:r>
-        <w:t xml:space="preserve">Decision 3: What should each role be allowed to do?</w:t>
-      </w:r>
-    </w:p>
-    <w:bookmarkStart w:id="44" w:name="Xd6bccec9c5078dca0276ee9eb44a2b60650a405"/>
+        <w:t xml:space="preserve">Role permissions</w:t>
+      </w:r>
+    </w:p>
+    <w:bookmarkStart w:id="47" w:name="Xd6bccec9c5078dca0276ee9eb44a2b60650a405"/>
     <w:p>
       <w:pPr>
         <w:pStyle w:val="Heading3"/>
@@ -2115,6 +2153,7 @@
           <w:tcPr/>
           <w:p>
             <w:pPr>
+              <w:keepNext/>
               <w:pStyle w:val="Compact"/>
               <w:jc w:val="left"/>
             </w:pPr>
@@ -2127,6 +2166,7 @@
           <w:tcPr/>
           <w:p>
             <w:pPr>
+              <w:keepNext/>
               <w:pStyle w:val="Compact"/>
               <w:jc w:val="left"/>
             </w:pPr>
@@ -2272,8 +2312,8 @@
         </w:tc>
       </w:tr>
     </w:tbl>
-    <w:bookmarkEnd w:id="44"/>
-    <w:bookmarkStart w:id="51" w:name="X9482277add752bcb7b179a08303520dbff42b6d"/>
+    <w:bookmarkEnd w:id="47"/>
+    <w:bookmarkStart w:id="54" w:name="X9482277add752bcb7b179a08303520dbff42b6d"/>
     <w:p>
       <w:pPr>
         <w:pStyle w:val="Heading3"/>
@@ -2294,7 +2334,7 @@
         <w:t xml:space="preserve">Apply only the restrictions your roles need.</w:t>
       </w:r>
     </w:p>
-    <w:bookmarkStart w:id="45" w:name="should-any-fields-be-hidden-or-read-only"/>
+    <w:bookmarkStart w:id="48" w:name="should-any-fields-be-hidden-or-read-only"/>
     <w:p>
       <w:pPr>
         <w:pStyle w:val="Heading4"/>
@@ -2331,6 +2371,7 @@
           <w:tcPr/>
           <w:p>
             <w:pPr>
+              <w:keepNext/>
               <w:pStyle w:val="Compact"/>
               <w:jc w:val="left"/>
             </w:pPr>
@@ -2343,6 +2384,7 @@
           <w:tcPr/>
           <w:p>
             <w:pPr>
+              <w:keepNext/>
               <w:pStyle w:val="Compact"/>
               <w:jc w:val="left"/>
             </w:pPr>
@@ -2457,8 +2499,8 @@
         <w:t xml:space="preserve">Field masking is not a substitute for denying access to a resource. For presentation-only changes, hide fields in the UI.</w:t>
       </w:r>
     </w:p>
-    <w:bookmarkEnd w:id="45"/>
-    <w:bookmarkStart w:id="46" w:name="X1af1c1e706322881b54d3a8e972e9679c2aa49f"/>
+    <w:bookmarkEnd w:id="48"/>
+    <w:bookmarkStart w:id="49" w:name="X1af1c1e706322881b54d3a8e972e9679c2aa49f"/>
     <w:p>
       <w:pPr>
         <w:pStyle w:val="Heading4"/>
@@ -2495,6 +2537,7 @@
           <w:tcPr/>
           <w:p>
             <w:pPr>
+              <w:keepNext/>
               <w:pStyle w:val="Compact"/>
               <w:jc w:val="left"/>
             </w:pPr>
@@ -2507,6 +2550,7 @@
           <w:tcPr/>
           <w:p>
             <w:pPr>
+              <w:keepNext/>
               <w:pStyle w:val="Compact"/>
               <w:jc w:val="left"/>
             </w:pPr>
@@ -2713,8 +2757,8 @@
         <w:t xml:space="preserve">to allow only creates or updates. Keep FHIRPath simple. If a Bot enforces complex rules, use a controlled invocation path; a Subscription-triggered Bot runs after the write and cannot reject it.</w:t>
       </w:r>
     </w:p>
-    <w:bookmarkEnd w:id="46"/>
-    <w:bookmarkStart w:id="50" w:name="X70422c87fcd81384a85dc281c011f062872145d"/>
+    <w:bookmarkEnd w:id="49"/>
+    <w:bookmarkStart w:id="53" w:name="X70422c87fcd81384a85dc281c011f062872145d"/>
     <w:p>
       <w:pPr>
         <w:pStyle w:val="Heading4"/>
@@ -2751,6 +2795,7 @@
           <w:tcPr/>
           <w:p>
             <w:pPr>
+              <w:keepNext/>
               <w:pStyle w:val="Compact"/>
               <w:jc w:val="left"/>
             </w:pPr>
@@ -2763,6 +2808,7 @@
           <w:tcPr/>
           <w:p>
             <w:pPr>
+              <w:keepNext/>
               <w:pStyle w:val="Compact"/>
               <w:jc w:val="left"/>
             </w:pPr>
@@ -3040,7 +3086,7 @@
       <w:r>
         <w:t xml:space="preserve"> </w:t>
       </w:r>
-      <w:hyperlink r:id="rId47">
+      <w:hyperlink r:id="rId50">
         <w:r>
           <w:rPr>
             <w:rStyle w:val="Hyperlink"/>
@@ -3062,7 +3108,7 @@
       <w:r>
         <w:t xml:space="preserve"> </w:t>
       </w:r>
-      <w:hyperlink r:id="rId48">
+      <w:hyperlink r:id="rId51">
         <w:r>
           <w:rPr>
             <w:rStyle w:val="Hyperlink"/>
@@ -3076,7 +3122,7 @@
       <w:r>
         <w:t xml:space="preserve"> </w:t>
       </w:r>
-      <w:hyperlink r:id="rId49">
+      <w:hyperlink r:id="rId52">
         <w:r>
           <w:rPr>
             <w:rStyle w:val="Hyperlink"/>
@@ -3088,9 +3134,9 @@
         <w:t xml:space="preserve">.</w:t>
       </w:r>
     </w:p>
-    <w:bookmarkEnd w:id="50"/>
-    <w:bookmarkEnd w:id="51"/>
-    <w:bookmarkStart w:id="52" w:name="should-the-ui-change-based-on-the-role"/>
+    <w:bookmarkEnd w:id="53"/>
+    <w:bookmarkEnd w:id="54"/>
+    <w:bookmarkStart w:id="56" w:name="should-the-ui-change-based-on-the-role"/>
     <w:p>
       <w:pPr>
         <w:pStyle w:val="Heading3"/>
@@ -3131,6 +3177,7 @@
           <w:tcPr/>
           <w:p>
             <w:pPr>
+              <w:keepNext/>
               <w:pStyle w:val="Compact"/>
               <w:jc w:val="left"/>
             </w:pPr>
@@ -3143,6 +3190,7 @@
           <w:tcPr/>
           <w:p>
             <w:pPr>
+              <w:keepNext/>
               <w:pStyle w:val="Compact"/>
               <w:jc w:val="left"/>
             </w:pPr>
@@ -3243,27 +3291,29 @@
       <w:r>
         <w:t xml:space="preserve"> </w:t>
       </w:r>
-      <w:hyperlink w:anchor="Xdcf65e12ff258a894869928054da5a9ce38bb61">
+      <w:hyperlink w:anchor="administration">
         <w:r>
           <w:rPr>
             <w:rStyle w:val="Hyperlink"/>
           </w:rPr>
-          <w:t xml:space="preserve">Decision 4</w:t>
+          <w:t xml:space="preserve">Administration</w:t>
         </w:r>
       </w:hyperlink>
       <w:r>
         <w:t xml:space="preserve">.</w:t>
       </w:r>
     </w:p>
-    <w:bookmarkEnd w:id="52"/>
-    <w:bookmarkEnd w:id="53"/>
-    <w:bookmarkStart w:id="57" w:name="Xdcf65e12ff258a894869928054da5a9ce38bb61"/>
+    <w:bookmarkStart w:id="55" w:name="Xdcf65e12ff258a894869928054da5a9ce38bb61"/>
+    <w:bookmarkEnd w:id="55"/>
+    <w:bookmarkEnd w:id="56"/>
+    <w:bookmarkEnd w:id="57"/>
+    <w:bookmarkStart w:id="63" w:name="administration"/>
     <w:p>
       <w:pPr>
         <w:pStyle w:val="Heading2"/>
       </w:pPr>
       <w:r>
-        <w:t xml:space="preserve">Decision 4: Who will administer users and configuration?</w:t>
+        <w:t xml:space="preserve">Administration</w:t>
       </w:r>
     </w:p>
     <w:p>
@@ -3294,6 +3344,7 @@
           <w:tcPr/>
           <w:p>
             <w:pPr>
+              <w:keepNext/>
               <w:pStyle w:val="Compact"/>
               <w:jc w:val="left"/>
             </w:pPr>
@@ -3306,6 +3357,7 @@
           <w:tcPr/>
           <w:p>
             <w:pPr>
+              <w:keepNext/>
               <w:pStyle w:val="Compact"/>
               <w:jc w:val="left"/>
             </w:pPr>
@@ -3531,7 +3583,7 @@
       <w:r>
         <w:t xml:space="preserve"> </w:t>
       </w:r>
-      <w:hyperlink r:id="rId54">
+      <w:hyperlink r:id="rId58">
         <w:r>
           <w:rPr>
             <w:rStyle w:val="Hyperlink"/>
@@ -3545,7 +3597,7 @@
       <w:r>
         <w:t xml:space="preserve"> </w:t>
       </w:r>
-      <w:hyperlink r:id="rId55">
+      <w:hyperlink r:id="rId59">
         <w:r>
           <w:rPr>
             <w:rStyle w:val="Hyperlink"/>
@@ -3559,7 +3611,7 @@
       <w:r>
         <w:t xml:space="preserve"> </w:t>
       </w:r>
-      <w:hyperlink r:id="rId56">
+      <w:hyperlink r:id="rId60">
         <w:r>
           <w:rPr>
             <w:rStyle w:val="Hyperlink"/>
@@ -3589,23 +3641,18 @@
         <w:t xml:space="preserve">Review the additional decisions below that apply to your application.</w:t>
       </w:r>
     </w:p>
-    <w:bookmarkEnd w:id="57"/>
-    <w:bookmarkStart w:id="67" w:name="additional-decisions-if-applicable"/>
+    <w:bookmarkStart w:id="61" w:name="additional-decisions-if-applicable"/>
+    <w:bookmarkEnd w:id="61"/>
+    <w:bookmarkStart w:id="62" w:name="X1b3a5e1144b0225df3807e086f4dfd1a93e3c1d"/>
+    <w:bookmarkEnd w:id="62"/>
+    <w:bookmarkEnd w:id="63"/>
+    <w:bookmarkStart w:id="69" w:name="patient-and-caregiver-access"/>
     <w:p>
       <w:pPr>
         <w:pStyle w:val="Heading2"/>
       </w:pPr>
       <w:r>
-        <w:t xml:space="preserve">Additional decisions, if applicable</w:t>
-      </w:r>
-    </w:p>
-    <w:bookmarkStart w:id="62" w:name="X1b3a5e1144b0225df3807e086f4dfd1a93e3c1d"/>
-    <w:p>
-      <w:pPr>
-        <w:pStyle w:val="Heading3"/>
-      </w:pPr>
-      <w:r>
-        <w:t xml:space="preserve">How will patients and caregivers get access?</w:t>
+        <w:t xml:space="preserve">Patient and caregiver access</w:t>
       </w:r>
     </w:p>
     <w:p>
@@ -3628,10 +3675,10 @@
         <w:t xml:space="preserve">Choose how patients register, whether caregivers or proxies need access (such as parents, adult children, or guardians), and how those relationships are established and revoked.</w:t>
       </w:r>
     </w:p>
-    <w:bookmarkStart w:id="58" w:name="how-will-patients-register"/>
-    <w:p>
-      <w:pPr>
-        <w:pStyle w:val="Heading4"/>
+    <w:bookmarkStart w:id="64" w:name="how-will-patients-register"/>
+    <w:p>
+      <w:pPr>
+        <w:pStyle w:val="Heading3"/>
       </w:pPr>
       <w:r>
         <w:t xml:space="preserve">How will patients register?</w:t>
@@ -3657,6 +3704,7 @@
           <w:tcPr/>
           <w:p>
             <w:pPr>
+              <w:keepNext/>
               <w:pStyle w:val="Compact"/>
               <w:jc w:val="left"/>
             </w:pPr>
@@ -3669,6 +3717,7 @@
           <w:tcPr/>
           <w:p>
             <w:pPr>
+              <w:keepNext/>
               <w:pStyle w:val="Compact"/>
               <w:jc w:val="left"/>
             </w:pPr>
@@ -3808,7 +3857,7 @@
       <w:r>
         <w:t xml:space="preserve"> </w:t>
       </w:r>
-      <w:hyperlink r:id="rId55">
+      <w:hyperlink r:id="rId59">
         <w:r>
           <w:rPr>
             <w:rStyle w:val="Hyperlink"/>
@@ -3820,11 +3869,11 @@
         <w:t xml:space="preserve">.</w:t>
       </w:r>
     </w:p>
-    <w:bookmarkEnd w:id="58"/>
-    <w:bookmarkStart w:id="61" w:name="X868e7299423d828dfd74eb8e917ec75612cf272"/>
-    <w:p>
-      <w:pPr>
-        <w:pStyle w:val="Heading4"/>
+    <w:bookmarkEnd w:id="64"/>
+    <w:bookmarkStart w:id="68" w:name="X868e7299423d828dfd74eb8e917ec75612cf272"/>
+    <w:p>
+      <w:pPr>
+        <w:pStyle w:val="Heading3"/>
       </w:pPr>
       <w:r>
         <w:t xml:space="preserve">Which patient records can each person access?</w:t>
@@ -3850,6 +3899,7 @@
           <w:tcPr/>
           <w:p>
             <w:pPr>
+              <w:keepNext/>
               <w:pStyle w:val="Compact"/>
               <w:jc w:val="left"/>
             </w:pPr>
@@ -3862,6 +3912,7 @@
           <w:tcPr/>
           <w:p>
             <w:pPr>
+              <w:keepNext/>
               <w:pStyle w:val="Compact"/>
               <w:jc w:val="left"/>
             </w:pPr>
@@ -4119,7 +4170,7 @@
       <w:r>
         <w:t xml:space="preserve"> </w:t>
       </w:r>
-      <w:hyperlink r:id="rId59">
+      <w:hyperlink r:id="rId65">
         <w:r>
           <w:rPr>
             <w:rStyle w:val="Hyperlink"/>
@@ -4133,7 +4184,7 @@
       <w:r>
         <w:t xml:space="preserve"> </w:t>
       </w:r>
-      <w:hyperlink r:id="rId60">
+      <w:hyperlink r:id="rId66">
         <w:r>
           <w:rPr>
             <w:rStyle w:val="Hyperlink"/>
@@ -4145,15 +4196,17 @@
         <w:t xml:space="preserve">.</w:t>
       </w:r>
     </w:p>
-    <w:bookmarkEnd w:id="61"/>
-    <w:bookmarkEnd w:id="62"/>
-    <w:bookmarkStart w:id="64" w:name="how-will-third-party-apps-get-access"/>
-    <w:p>
-      <w:pPr>
-        <w:pStyle w:val="Heading3"/>
-      </w:pPr>
-      <w:r>
-        <w:t xml:space="preserve">How will third-party apps get access?</w:t>
+    <w:bookmarkStart w:id="67" w:name="how-will-third-party-apps-get-access"/>
+    <w:bookmarkEnd w:id="67"/>
+    <w:bookmarkEnd w:id="68"/>
+    <w:bookmarkEnd w:id="69"/>
+    <w:bookmarkStart w:id="72" w:name="third-party-app-access"/>
+    <w:p>
+      <w:pPr>
+        <w:pStyle w:val="Heading2"/>
+      </w:pPr>
+      <w:r>
+        <w:t xml:space="preserve">Third-party app access</w:t>
       </w:r>
     </w:p>
     <w:p>
@@ -4202,6 +4255,7 @@
           <w:tcPr/>
           <w:p>
             <w:pPr>
+              <w:keepNext/>
               <w:pStyle w:val="Compact"/>
               <w:jc w:val="left"/>
             </w:pPr>
@@ -4214,6 +4268,7 @@
           <w:tcPr/>
           <w:p>
             <w:pPr>
+              <w:keepNext/>
               <w:pStyle w:val="Compact"/>
               <w:jc w:val="left"/>
             </w:pPr>
@@ -4545,7 +4600,7 @@
       <w:r>
         <w:t xml:space="preserve"> </w:t>
       </w:r>
-      <w:hyperlink r:id="rId63">
+      <w:hyperlink r:id="rId70">
         <w:r>
           <w:rPr>
             <w:rStyle w:val="Hyperlink"/>
@@ -4557,14 +4612,16 @@
         <w:t xml:space="preserve">.</w:t>
       </w:r>
     </w:p>
-    <w:bookmarkEnd w:id="64"/>
-    <w:bookmarkStart w:id="66" w:name="X0b6fa8281b5f865471d78f98975d7269c9272cd"/>
-    <w:p>
-      <w:pPr>
-        <w:pStyle w:val="Heading3"/>
-      </w:pPr>
-      <w:r>
-        <w:t xml:space="preserve">Should access be restricted to specific networks?</w:t>
+    <w:bookmarkStart w:id="71" w:name="X0b6fa8281b5f865471d78f98975d7269c9272cd"/>
+    <w:bookmarkEnd w:id="71"/>
+    <w:bookmarkEnd w:id="72"/>
+    <w:bookmarkStart w:id="74" w:name="network-restrictions"/>
+    <w:p>
+      <w:pPr>
+        <w:pStyle w:val="Heading2"/>
+      </w:pPr>
+      <w:r>
+        <w:t xml:space="preserve">Network restrictions</w:t>
       </w:r>
     </w:p>
     <w:p>
@@ -4607,6 +4664,7 @@
           <w:tcPr/>
           <w:p>
             <w:pPr>
+              <w:keepNext/>
               <w:pStyle w:val="Compact"/>
               <w:jc w:val="left"/>
             </w:pPr>
@@ -4619,6 +4677,7 @@
           <w:tcPr/>
           <w:p>
             <w:pPr>
+              <w:keepNext/>
               <w:pStyle w:val="Compact"/>
               <w:jc w:val="left"/>
             </w:pPr>
@@ -4742,7 +4801,7 @@
       <w:r>
         <w:t xml:space="preserve"> </w:t>
       </w:r>
-      <w:hyperlink r:id="rId65">
+      <w:hyperlink r:id="rId73">
         <w:r>
           <w:rPr>
             <w:rStyle w:val="Hyperlink"/>
@@ -4754,9 +4813,8 @@
         <w:t xml:space="preserve">.</w:t>
       </w:r>
     </w:p>
-    <w:bookmarkEnd w:id="66"/>
-    <w:bookmarkEnd w:id="67"/>
-    <w:bookmarkEnd w:id="68"/>
+    <w:bookmarkEnd w:id="74"/>
+    <w:bookmarkEnd w:id="75"/>
     <w:sectPr>
       <w:pgSz w:h="15840" w:w="12240"/>
       <w:pgMar w:bottom="1440" w:footer="720" w:gutter="0" w:header="720" w:left="1440" w:right="1440" w:top="1440"/>

</xml_diff>